<commit_message>
Modificaiciones y compleción de trabajo
</commit_message>
<xml_diff>
--- a/UD2/A3/Marco Valiente - A2.3 - Preparando VSCode para Java.docx
+++ b/UD2/A3/Marco Valiente - A2.3 - Preparando VSCode para Java.docx
@@ -1,6 +1,6 @@
 
 <file path=word/document.xml><?xml version="1.0" encoding="utf-8"?>
-<w:document xmlns:wpc="http://schemas.microsoft.com/office/word/2010/wordprocessingCanvas" xmlns:cx="http://schemas.microsoft.com/office/drawing/2014/chartex" xmlns:mc="http://schemas.openxmlformats.org/markup-compatibility/2006" xmlns:o="urn:schemas-microsoft-com:office:office" xmlns:r="http://schemas.openxmlformats.org/officeDocument/2006/relationships" xmlns:m="http://schemas.openxmlformats.org/officeDocument/2006/math" xmlns:v="urn:schemas-microsoft-com:vml" xmlns:wp14="http://schemas.microsoft.com/office/word/2010/wordprocessingDrawing" xmlns:wp="http://schemas.openxmlformats.org/drawingml/2006/wordprocessingDrawing" xmlns:w10="urn:schemas-microsoft-com:office:word" xmlns:w="http://schemas.openxmlformats.org/wordprocessingml/2006/main" xmlns:w14="http://schemas.microsoft.com/office/word/2010/wordml" xmlns:w15="http://schemas.microsoft.com/office/word/2012/wordml" xmlns:w16se="http://schemas.microsoft.com/office/word/2015/wordml/symex" xmlns:wpg="http://schemas.microsoft.com/office/word/2010/wordprocessingGroup" xmlns:wpi="http://schemas.microsoft.com/office/word/2010/wordprocessingInk" xmlns:wne="http://schemas.microsoft.com/office/word/2006/wordml" xmlns:wps="http://schemas.microsoft.com/office/word/2010/wordprocessingShape" mc:Ignorable="w14 w15 w16se wp14">
+<w:document xmlns:wpc="http://schemas.microsoft.com/office/word/2010/wordprocessingCanvas" xmlns:cx="http://schemas.microsoft.com/office/drawing/2014/chartex" xmlns:cx1="http://schemas.microsoft.com/office/drawing/2015/9/8/chartex" xmlns:cx2="http://schemas.microsoft.com/office/drawing/2015/10/21/chartex" xmlns:cx3="http://schemas.microsoft.com/office/drawing/2016/5/9/chartex" xmlns:cx4="http://schemas.microsoft.com/office/drawing/2016/5/10/chartex" xmlns:cx5="http://schemas.microsoft.com/office/drawing/2016/5/11/chartex" xmlns:cx6="http://schemas.microsoft.com/office/drawing/2016/5/12/chartex" xmlns:cx7="http://schemas.microsoft.com/office/drawing/2016/5/13/chartex" xmlns:cx8="http://schemas.microsoft.com/office/drawing/2016/5/14/chartex" xmlns:mc="http://schemas.openxmlformats.org/markup-compatibility/2006" xmlns:aink="http://schemas.microsoft.com/office/drawing/2016/ink" xmlns:am3d="http://schemas.microsoft.com/office/drawing/2017/model3d" xmlns:o="urn:schemas-microsoft-com:office:office" xmlns:oel="http://schemas.microsoft.com/office/2019/extlst" xmlns:r="http://schemas.openxmlformats.org/officeDocument/2006/relationships" xmlns:m="http://schemas.openxmlformats.org/officeDocument/2006/math" xmlns:v="urn:schemas-microsoft-com:vml" xmlns:wp14="http://schemas.microsoft.com/office/word/2010/wordprocessingDrawing" xmlns:wp="http://schemas.openxmlformats.org/drawingml/2006/wordprocessingDrawing" xmlns:w10="urn:schemas-microsoft-com:office:word" xmlns:w="http://schemas.openxmlformats.org/wordprocessingml/2006/main" xmlns:w14="http://schemas.microsoft.com/office/word/2010/wordml" xmlns:w15="http://schemas.microsoft.com/office/word/2012/wordml" xmlns:w16cex="http://schemas.microsoft.com/office/word/2018/wordml/cex" xmlns:w16cid="http://schemas.microsoft.com/office/word/2016/wordml/cid" xmlns:w16="http://schemas.microsoft.com/office/word/2018/wordml" xmlns:w16du="http://schemas.microsoft.com/office/word/2023/wordml/word16du" xmlns:w16sdtdh="http://schemas.microsoft.com/office/word/2020/wordml/sdtdatahash" xmlns:w16sdtfl="http://schemas.microsoft.com/office/word/2024/wordml/sdtformatlock" xmlns:w16se="http://schemas.microsoft.com/office/word/2015/wordml/symex" xmlns:wpg="http://schemas.microsoft.com/office/word/2010/wordprocessingGroup" xmlns:wpi="http://schemas.microsoft.com/office/word/2010/wordprocessingInk" xmlns:wne="http://schemas.microsoft.com/office/word/2006/wordml" xmlns:wps="http://schemas.microsoft.com/office/word/2010/wordprocessingShape" mc:Ignorable="w14 w15 w16se w16cid w16 w16cex w16sdtdh w16sdtfl w16du wp14">
   <w:body>
     <w:sdt>
       <w:sdtPr>
@@ -26,7 +26,7 @@
       <w:sdtContent>
         <w:p>
           <w:pPr>
-            <w:pStyle w:val="Sinespaciado"/>
+            <w:pStyle w:val="NoSpacing"/>
             <w:spacing w:before="1540" w:after="240"/>
             <w:jc w:val="center"/>
             <w:rPr>
@@ -119,7 +119,7 @@
           <w:sdtContent>
             <w:p>
               <w:pPr>
-                <w:pStyle w:val="Sinespaciado"/>
+                <w:pStyle w:val="NoSpacing"/>
                 <w:pBdr>
                   <w:top w:val="single" w:sz="6" w:space="6" w:color="5B9BD5" w:themeColor="accent1"/>
                   <w:bottom w:val="single" w:sz="6" w:space="6" w:color="5B9BD5" w:themeColor="accent1"/>
@@ -166,7 +166,7 @@
           <w:sdtContent>
             <w:p>
               <w:pPr>
-                <w:pStyle w:val="Sinespaciado"/>
+                <w:pStyle w:val="NoSpacing"/>
                 <w:jc w:val="center"/>
                 <w:rPr>
                   <w:color w:val="5B9BD5" w:themeColor="accent1"/>
@@ -195,7 +195,7 @@
         </w:sdt>
         <w:p>
           <w:pPr>
-            <w:pStyle w:val="Sinespaciado"/>
+            <w:pStyle w:val="NoSpacing"/>
             <w:spacing w:before="480"/>
             <w:jc w:val="center"/>
             <w:rPr>
@@ -283,7 +283,7 @@
                                 <w:sdtContent>
                                   <w:p>
                                     <w:pPr>
-                                      <w:pStyle w:val="Sinespaciado"/>
+                                      <w:pStyle w:val="NoSpacing"/>
                                       <w:jc w:val="center"/>
                                       <w:rPr>
                                         <w:color w:val="5B9BD5" w:themeColor="accent1"/>
@@ -315,7 +315,7 @@
                                 <w:sdtContent>
                                   <w:p>
                                     <w:pPr>
-                                      <w:pStyle w:val="Sinespaciado"/>
+                                      <w:pStyle w:val="NoSpacing"/>
                                       <w:jc w:val="center"/>
                                       <w:rPr>
                                         <w:color w:val="5B9BD5" w:themeColor="accent1"/>
@@ -356,7 +356,7 @@
                     <v:stroke joinstyle="miter"/>
                     <v:path gradientshapeok="t" o:connecttype="rect"/>
                   </v:shapetype>
-                  <v:shape id="Cuadro de texto 142" o:spid="_x0000_s1026" type="#_x0000_t202" style="position:absolute;left:0;text-align:left;margin-left:0;margin-top:0;width:516pt;height:43.9pt;z-index:251659264;visibility:visible;mso-wrap-style:square;mso-width-percent:1000;mso-height-percent:0;mso-top-percent:850;mso-wrap-distance-left:9pt;mso-wrap-distance-top:0;mso-wrap-distance-right:9pt;mso-wrap-distance-bottom:0;mso-position-horizontal:center;mso-position-horizontal-relative:margin;mso-position-vertical-relative:page;mso-width-percent:1000;mso-height-percent:0;mso-top-percent:850;mso-width-relative:margin;mso-height-relative:margin;v-text-anchor:bottom" o:gfxdata="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" filled="f" stroked="f" strokeweight=".5pt">
+                  <v:shape id="Cuadro de texto 142" o:spid="_x0000_s1026" type="#_x0000_t202" style="position:absolute;left:0;text-align:left;margin-left:0;margin-top:0;width:516pt;height:43.9pt;z-index:251659264;visibility:visible;mso-wrap-style:square;mso-width-percent:1000;mso-height-percent:0;mso-top-percent:850;mso-wrap-distance-left:9pt;mso-wrap-distance-top:0;mso-wrap-distance-right:9pt;mso-wrap-distance-bottom:0;mso-position-horizontal:center;mso-position-horizontal-relative:margin;mso-position-vertical-relative:page;mso-width-percent:1000;mso-height-percent:0;mso-top-percent:850;mso-width-relative:margin;mso-height-relative:margin;v-text-anchor:bottom" o:gfxdata="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" filled="f" stroked="f" strokeweight=".5pt">
                     <v:textbox style="mso-fit-shape-to-text:t" inset="0,0,0,0">
                       <w:txbxContent>
                         <w:sdt>
@@ -376,7 +376,7 @@
                           <w:sdtContent>
                             <w:p>
                               <w:pPr>
-                                <w:pStyle w:val="Sinespaciado"/>
+                                <w:pStyle w:val="NoSpacing"/>
                                 <w:jc w:val="center"/>
                                 <w:rPr>
                                   <w:color w:val="5B9BD5" w:themeColor="accent1"/>
@@ -408,7 +408,7 @@
                           <w:sdtContent>
                             <w:p>
                               <w:pPr>
-                                <w:pStyle w:val="Sinespaciado"/>
+                                <w:pStyle w:val="NoSpacing"/>
                                 <w:jc w:val="center"/>
                                 <w:rPr>
                                   <w:color w:val="5B9BD5" w:themeColor="accent1"/>
@@ -515,7 +515,7 @@
           <w:sdtContent>
             <w:p>
               <w:pPr>
-                <w:pStyle w:val="TtuloTDC"/>
+                <w:pStyle w:val="TOCHeading"/>
               </w:pPr>
               <w:r>
                 <w:t>Contenido</w:t>
@@ -523,14 +523,18 @@
             </w:p>
             <w:p>
               <w:pPr>
-                <w:pStyle w:val="TDC1"/>
+                <w:pStyle w:val="TOC1"/>
                 <w:tabs>
                   <w:tab w:val="right" w:leader="dot" w:pos="8494"/>
                 </w:tabs>
                 <w:rPr>
                   <w:rFonts w:eastAsiaTheme="minorEastAsia"/>
                   <w:noProof/>
-                  <w:lang w:eastAsia="es-ES"/>
+                  <w:kern w:val="2"/>
+                  <w:sz w:val="24"/>
+                  <w:szCs w:val="24"/>
+                  <w:lang w:val="en-GB" w:eastAsia="en-GB"/>
+                  <w14:ligatures w14:val="standardContextual"/>
                 </w:rPr>
               </w:pPr>
               <w:r>
@@ -542,10 +546,10 @@
               <w:r>
                 <w:fldChar w:fldCharType="separate"/>
               </w:r>
-              <w:hyperlink w:anchor="_Toc219454786" w:history="1">
-                <w:r>
-                  <w:rPr>
-                    <w:rStyle w:val="Hipervnculo"/>
+              <w:hyperlink w:anchor="_Toc219497647" w:history="1">
+                <w:r>
+                  <w:rPr>
+                    <w:rStyle w:val="Hyperlink"/>
                     <w:noProof/>
                   </w:rPr>
                   <w:t>Introducción</w:t>
@@ -569,7 +573,7 @@
                     <w:noProof/>
                     <w:webHidden/>
                   </w:rPr>
-                  <w:instrText xml:space="preserve"> PAGEREF _Toc219454786 \h </w:instrText>
+                  <w:instrText xml:space="preserve"> PAGEREF _Toc219497647 \h </w:instrText>
                 </w:r>
                 <w:r>
                   <w:rPr>
@@ -602,20 +606,24 @@
             </w:p>
             <w:p>
               <w:pPr>
-                <w:pStyle w:val="TDC1"/>
+                <w:pStyle w:val="TOC1"/>
                 <w:tabs>
                   <w:tab w:val="right" w:leader="dot" w:pos="8494"/>
                 </w:tabs>
                 <w:rPr>
                   <w:rFonts w:eastAsiaTheme="minorEastAsia"/>
                   <w:noProof/>
-                  <w:lang w:eastAsia="es-ES"/>
+                  <w:kern w:val="2"/>
+                  <w:sz w:val="24"/>
+                  <w:szCs w:val="24"/>
+                  <w:lang w:val="en-GB" w:eastAsia="en-GB"/>
+                  <w14:ligatures w14:val="standardContextual"/>
                 </w:rPr>
               </w:pPr>
-              <w:hyperlink w:anchor="_Toc219454787" w:history="1">
-                <w:r>
-                  <w:rPr>
-                    <w:rStyle w:val="Hipervnculo"/>
+              <w:hyperlink w:anchor="_Toc219497648" w:history="1">
+                <w:r>
+                  <w:rPr>
+                    <w:rStyle w:val="Hyperlink"/>
                     <w:rFonts w:cs="Arial"/>
                     <w:noProof/>
                   </w:rPr>
@@ -640,7 +648,7 @@
                     <w:noProof/>
                     <w:webHidden/>
                   </w:rPr>
-                  <w:instrText xml:space="preserve"> PAGEREF _Toc219454787 \h </w:instrText>
+                  <w:instrText xml:space="preserve"> PAGEREF _Toc219497648 \h </w:instrText>
                 </w:r>
                 <w:r>
                   <w:rPr>
@@ -673,21 +681,25 @@
             </w:p>
             <w:p>
               <w:pPr>
-                <w:pStyle w:val="TDC2"/>
+                <w:pStyle w:val="TOC2"/>
                 <w:tabs>
-                  <w:tab w:val="left" w:pos="660"/>
+                  <w:tab w:val="left" w:pos="720"/>
                   <w:tab w:val="right" w:leader="dot" w:pos="8494"/>
                 </w:tabs>
                 <w:rPr>
                   <w:rFonts w:eastAsiaTheme="minorEastAsia"/>
                   <w:noProof/>
-                  <w:lang w:eastAsia="es-ES"/>
+                  <w:kern w:val="2"/>
+                  <w:sz w:val="24"/>
+                  <w:szCs w:val="24"/>
+                  <w:lang w:val="en-GB" w:eastAsia="en-GB"/>
+                  <w14:ligatures w14:val="standardContextual"/>
                 </w:rPr>
               </w:pPr>
-              <w:hyperlink w:anchor="_Toc219454788" w:history="1">
-                <w:r>
-                  <w:rPr>
-                    <w:rStyle w:val="Hipervnculo"/>
+              <w:hyperlink w:anchor="_Toc219497649" w:history="1">
+                <w:r>
+                  <w:rPr>
+                    <w:rStyle w:val="Hyperlink"/>
                     <w:noProof/>
                   </w:rPr>
                   <w:t>1.</w:t>
@@ -696,16 +708,20 @@
                   <w:rPr>
                     <w:rFonts w:eastAsiaTheme="minorEastAsia"/>
                     <w:noProof/>
-                    <w:lang w:eastAsia="es-ES"/>
+                    <w:kern w:val="2"/>
+                    <w:sz w:val="24"/>
+                    <w:szCs w:val="24"/>
+                    <w:lang w:val="en-GB" w:eastAsia="en-GB"/>
+                    <w14:ligatures w14:val="standardContextual"/>
                   </w:rPr>
                   <w:tab/>
                 </w:r>
                 <w:r>
                   <w:rPr>
-                    <w:rStyle w:val="Hipervnculo"/>
-                    <w:noProof/>
-                  </w:rPr>
-                  <w:t>Instalación de un Plugin en IntelliJ</w:t>
+                    <w:rStyle w:val="Hyperlink"/>
+                    <w:noProof/>
+                  </w:rPr>
+                  <w:t>Investigación de problemas a superar</w:t>
                 </w:r>
                 <w:r>
                   <w:rPr>
@@ -726,7 +742,7 @@
                     <w:noProof/>
                     <w:webHidden/>
                   </w:rPr>
-                  <w:instrText xml:space="preserve"> PAGEREF _Toc219454788 \h </w:instrText>
+                  <w:instrText xml:space="preserve"> PAGEREF _Toc219497649 \h </w:instrText>
                 </w:r>
                 <w:r>
                   <w:rPr>
@@ -759,21 +775,25 @@
             </w:p>
             <w:p>
               <w:pPr>
-                <w:pStyle w:val="TDC2"/>
+                <w:pStyle w:val="TOC2"/>
                 <w:tabs>
-                  <w:tab w:val="left" w:pos="660"/>
+                  <w:tab w:val="left" w:pos="720"/>
                   <w:tab w:val="right" w:leader="dot" w:pos="8494"/>
                 </w:tabs>
                 <w:rPr>
                   <w:rFonts w:eastAsiaTheme="minorEastAsia"/>
                   <w:noProof/>
-                  <w:lang w:eastAsia="es-ES"/>
+                  <w:kern w:val="2"/>
+                  <w:sz w:val="24"/>
+                  <w:szCs w:val="24"/>
+                  <w:lang w:val="en-GB" w:eastAsia="en-GB"/>
+                  <w14:ligatures w14:val="standardContextual"/>
                 </w:rPr>
               </w:pPr>
-              <w:hyperlink w:anchor="_Toc219454789" w:history="1">
-                <w:r>
-                  <w:rPr>
-                    <w:rStyle w:val="Hipervnculo"/>
+              <w:hyperlink w:anchor="_Toc219497650" w:history="1">
+                <w:r>
+                  <w:rPr>
+                    <w:rStyle w:val="Hyperlink"/>
                     <w:noProof/>
                   </w:rPr>
                   <w:t>2.</w:t>
@@ -782,16 +802,20 @@
                   <w:rPr>
                     <w:rFonts w:eastAsiaTheme="minorEastAsia"/>
                     <w:noProof/>
-                    <w:lang w:eastAsia="es-ES"/>
+                    <w:kern w:val="2"/>
+                    <w:sz w:val="24"/>
+                    <w:szCs w:val="24"/>
+                    <w:lang w:val="en-GB" w:eastAsia="en-GB"/>
+                    <w14:ligatures w14:val="standardContextual"/>
                   </w:rPr>
                   <w:tab/>
                 </w:r>
                 <w:r>
                   <w:rPr>
-                    <w:rStyle w:val="Hipervnculo"/>
-                    <w:noProof/>
-                  </w:rPr>
-                  <w:t>Instalación de Extensiones de Visual Studio Code</w:t>
+                    <w:rStyle w:val="Hyperlink"/>
+                    <w:noProof/>
+                  </w:rPr>
+                  <w:t>Soluciones a través de Extensiones de Visual Studio Code</w:t>
                 </w:r>
                 <w:r>
                   <w:rPr>
@@ -812,7 +836,7 @@
                     <w:noProof/>
                     <w:webHidden/>
                   </w:rPr>
-                  <w:instrText xml:space="preserve"> PAGEREF _Toc219454789 \h </w:instrText>
+                  <w:instrText xml:space="preserve"> PAGEREF _Toc219497650 \h </w:instrText>
                 </w:r>
                 <w:r>
                   <w:rPr>
@@ -832,7 +856,7 @@
                     <w:noProof/>
                     <w:webHidden/>
                   </w:rPr>
-                  <w:t>6</w:t>
+                  <w:t>3</w:t>
                 </w:r>
                 <w:r>
                   <w:rPr>
@@ -845,20 +869,24 @@
             </w:p>
             <w:p>
               <w:pPr>
-                <w:pStyle w:val="TDC1"/>
+                <w:pStyle w:val="TOC1"/>
                 <w:tabs>
                   <w:tab w:val="right" w:leader="dot" w:pos="8494"/>
                 </w:tabs>
                 <w:rPr>
                   <w:rFonts w:eastAsiaTheme="minorEastAsia"/>
                   <w:noProof/>
-                  <w:lang w:eastAsia="es-ES"/>
+                  <w:kern w:val="2"/>
+                  <w:sz w:val="24"/>
+                  <w:szCs w:val="24"/>
+                  <w:lang w:val="en-GB" w:eastAsia="en-GB"/>
+                  <w14:ligatures w14:val="standardContextual"/>
                 </w:rPr>
               </w:pPr>
-              <w:hyperlink w:anchor="_Toc219454790" w:history="1">
-                <w:r>
-                  <w:rPr>
-                    <w:rStyle w:val="Hipervnculo"/>
+              <w:hyperlink w:anchor="_Toc219497651" w:history="1">
+                <w:r>
+                  <w:rPr>
+                    <w:rStyle w:val="Hyperlink"/>
                     <w:noProof/>
                   </w:rPr>
                   <w:t>Conclusiones</w:t>
@@ -882,7 +910,7 @@
                     <w:noProof/>
                     <w:webHidden/>
                   </w:rPr>
-                  <w:instrText xml:space="preserve"> PAGEREF _Toc219454790 \h </w:instrText>
+                  <w:instrText xml:space="preserve"> PAGEREF _Toc219497651 \h </w:instrText>
                 </w:r>
                 <w:r>
                   <w:rPr>
@@ -902,7 +930,7 @@
                     <w:noProof/>
                     <w:webHidden/>
                   </w:rPr>
-                  <w:t>9</w:t>
+                  <w:t>5</w:t>
                 </w:r>
                 <w:r>
                   <w:rPr>
@@ -915,20 +943,24 @@
             </w:p>
             <w:p>
               <w:pPr>
-                <w:pStyle w:val="TDC1"/>
+                <w:pStyle w:val="TOC1"/>
                 <w:tabs>
                   <w:tab w:val="right" w:leader="dot" w:pos="8494"/>
                 </w:tabs>
                 <w:rPr>
                   <w:rFonts w:eastAsiaTheme="minorEastAsia"/>
                   <w:noProof/>
-                  <w:lang w:eastAsia="es-ES"/>
+                  <w:kern w:val="2"/>
+                  <w:sz w:val="24"/>
+                  <w:szCs w:val="24"/>
+                  <w:lang w:val="en-GB" w:eastAsia="en-GB"/>
+                  <w14:ligatures w14:val="standardContextual"/>
                 </w:rPr>
               </w:pPr>
-              <w:hyperlink w:anchor="_Toc219454791" w:history="1">
-                <w:r>
-                  <w:rPr>
-                    <w:rStyle w:val="Hipervnculo"/>
+              <w:hyperlink w:anchor="_Toc219497652" w:history="1">
+                <w:r>
+                  <w:rPr>
+                    <w:rStyle w:val="Hyperlink"/>
                     <w:noProof/>
                   </w:rPr>
                   <w:t>Bibliografía</w:t>
@@ -952,7 +984,7 @@
                     <w:noProof/>
                     <w:webHidden/>
                   </w:rPr>
-                  <w:instrText xml:space="preserve"> PAGEREF _Toc219454791 \h </w:instrText>
+                  <w:instrText xml:space="preserve"> PAGEREF _Toc219497652 \h </w:instrText>
                 </w:r>
                 <w:r>
                   <w:rPr>
@@ -972,7 +1004,7 @@
                     <w:noProof/>
                     <w:webHidden/>
                   </w:rPr>
-                  <w:t>10</w:t>
+                  <w:t>6</w:t>
                 </w:r>
                 <w:r>
                   <w:rPr>
@@ -1001,9 +1033,9 @@
         </w:p>
         <w:p>
           <w:pPr>
-            <w:pStyle w:val="Ttulo1"/>
+            <w:pStyle w:val="Heading1"/>
           </w:pPr>
-          <w:bookmarkStart w:id="0" w:name="_Toc219454786"/>
+          <w:bookmarkStart w:id="0" w:name="_Toc219497647"/>
           <w:r>
             <w:lastRenderedPageBreak/>
             <w:t>Introducción</w:t>
@@ -1021,13 +1053,8 @@
           </w:r>
           <w:proofErr w:type="spellEnd"/>
           <w:r>
-            <w:t xml:space="preserve"> para adaptarle mejor a proyectos en Java y proyectos en </w:t>
+            <w:t xml:space="preserve"> para adaptarle mejor a proyectos en Java y proyectos en Maven.</w:t>
           </w:r>
-          <w:proofErr w:type="spellStart"/>
-          <w:r>
-            <w:t>Maven.</w:t>
-          </w:r>
-          <w:proofErr w:type="spellEnd"/>
         </w:p>
         <w:p>
           <w:r>
@@ -1049,12 +1076,12 @@
         </w:p>
         <w:p>
           <w:pPr>
-            <w:pStyle w:val="Ttulo1"/>
+            <w:pStyle w:val="Heading1"/>
             <w:rPr>
               <w:b w:val="0"/>
             </w:rPr>
           </w:pPr>
-          <w:bookmarkStart w:id="1" w:name="_Toc219454787"/>
+          <w:bookmarkStart w:id="1" w:name="_Toc219497648"/>
           <w:r>
             <w:rPr>
               <w:rFonts w:cs="Arial"/>
@@ -1070,194 +1097,264 @@
     <w:p/>
     <w:p>
       <w:pPr>
-        <w:pStyle w:val="Ttulo2"/>
+        <w:pStyle w:val="Heading2"/>
         <w:numPr>
           <w:ilvl w:val="0"/>
           <w:numId w:val="1"/>
         </w:numPr>
       </w:pPr>
+      <w:bookmarkStart w:id="2" w:name="_Toc219497649"/>
       <w:r>
         <w:t>Investigación de problemas a superar</w:t>
       </w:r>
-    </w:p>
-    <w:p/>
-    <w:p>
-      <w:r>
-        <w:t xml:space="preserve">Para comenzar con esta actividad, no podemos hacer una adaptación de </w:t>
-      </w:r>
-      <w:proofErr w:type="spellStart"/>
-      <w:r>
-        <w:t>VSCode</w:t>
-      </w:r>
-      <w:proofErr w:type="spellEnd"/>
-      <w:r>
-        <w:t xml:space="preserve"> para programar en Java sin saber ya por defecto cuales son los problemas que </w:t>
-      </w:r>
-      <w:proofErr w:type="spellStart"/>
-      <w:r>
-        <w:t>VSCode</w:t>
-      </w:r>
-      <w:proofErr w:type="spellEnd"/>
-      <w:r>
-        <w:t xml:space="preserve"> tiene de por sí en lo que se refiere en programación en Java.</w:t>
-      </w:r>
-      <w:bookmarkStart w:id="2" w:name="_GoBack"/>
       <w:bookmarkEnd w:id="2"/>
     </w:p>
     <w:p/>
     <w:p>
-      <w:pPr>
-        <w:pStyle w:val="Ttulo2"/>
+      <w:r>
+        <w:t xml:space="preserve">Para comenzar con esta actividad, no podemos hacer una adaptación de </w:t>
+      </w:r>
+      <w:proofErr w:type="spellStart"/>
+      <w:r>
+        <w:t>VSCode</w:t>
+      </w:r>
+      <w:proofErr w:type="spellEnd"/>
+      <w:r>
+        <w:t xml:space="preserve"> para programar en Java sin saber ya por defecto cuales son los problemas que </w:t>
+      </w:r>
+      <w:proofErr w:type="spellStart"/>
+      <w:r>
+        <w:t>VSCode</w:t>
+      </w:r>
+      <w:proofErr w:type="spellEnd"/>
+      <w:r>
+        <w:t xml:space="preserve"> tiene de por sí en lo que se refiere en programación en Java.</w:t>
+      </w:r>
+    </w:p>
+    <w:p>
+      <w:pPr>
+        <w:pStyle w:val="ListParagraph"/>
+        <w:numPr>
+          <w:ilvl w:val="0"/>
+          <w:numId w:val="5"/>
+        </w:numPr>
+      </w:pPr>
+      <w:r>
+        <w:rPr>
+          <w:b/>
+          <w:bCs/>
+        </w:rPr>
+        <w:t>No reconoce el JDK</w:t>
+      </w:r>
+      <w:r>
+        <w:rPr>
+          <w:b/>
+          <w:bCs/>
+        </w:rPr>
+        <w:t xml:space="preserve"> por defecto</w:t>
+      </w:r>
+      <w:r>
+        <w:rPr>
+          <w:b/>
+          <w:bCs/>
+        </w:rPr>
+        <w:t xml:space="preserve">. </w:t>
+      </w:r>
+      <w:r>
+        <w:t>El primer problema que tiene</w:t>
+      </w:r>
+      <w:r>
+        <w:t xml:space="preserve"> es que </w:t>
+      </w:r>
+      <w:proofErr w:type="spellStart"/>
+      <w:r>
+        <w:t>VSCode</w:t>
+      </w:r>
+      <w:proofErr w:type="spellEnd"/>
+      <w:r>
+        <w:t xml:space="preserve"> no reconoce de forma inmediata lo llamado Java </w:t>
+      </w:r>
+      <w:proofErr w:type="spellStart"/>
+      <w:r>
+        <w:t>Development</w:t>
+      </w:r>
+      <w:proofErr w:type="spellEnd"/>
+      <w:r>
+        <w:t xml:space="preserve"> Kit.</w:t>
+      </w:r>
+    </w:p>
+    <w:p>
+      <w:pPr>
+        <w:pStyle w:val="ListParagraph"/>
+        <w:numPr>
+          <w:ilvl w:val="0"/>
+          <w:numId w:val="5"/>
+        </w:numPr>
+      </w:pPr>
+      <w:r>
+        <w:rPr>
+          <w:b/>
+          <w:bCs/>
+        </w:rPr>
+        <w:t xml:space="preserve">Falta de soporte para Java 9+. </w:t>
+      </w:r>
+      <w:r>
+        <w:t xml:space="preserve">Sin ayuda de </w:t>
+      </w:r>
+      <w:r>
+        <w:t>configuración manual o extensiones de terceros no se puede usar para las versiones superiores a Java 8.</w:t>
+      </w:r>
+    </w:p>
+    <w:p>
+      <w:pPr>
+        <w:pStyle w:val="ListParagraph"/>
+        <w:numPr>
+          <w:ilvl w:val="0"/>
+          <w:numId w:val="5"/>
+        </w:numPr>
+      </w:pPr>
+      <w:r>
+        <w:rPr>
+          <w:b/>
+          <w:bCs/>
+        </w:rPr>
+        <w:t>Falta de potencia para grandes proyectos.</w:t>
+      </w:r>
+      <w:r>
+        <w:t xml:space="preserve"> </w:t>
+      </w:r>
+      <w:proofErr w:type="spellStart"/>
+      <w:r>
+        <w:t>VSCode</w:t>
+      </w:r>
+      <w:proofErr w:type="spellEnd"/>
+      <w:r>
+        <w:t xml:space="preserve"> suele estar diseñado para pequeños programas en Java que hagas y ejecutes correctamente, pero no para los procesos </w:t>
+      </w:r>
+      <w:r>
+        <w:t>más</w:t>
+      </w:r>
+      <w:r>
+        <w:t xml:space="preserve"> grandes a ejecutar.</w:t>
+      </w:r>
+    </w:p>
+    <w:p>
+      <w:pPr>
+        <w:pStyle w:val="ListParagraph"/>
+        <w:numPr>
+          <w:ilvl w:val="0"/>
+          <w:numId w:val="5"/>
+        </w:numPr>
+      </w:pPr>
+      <w:r>
+        <w:rPr>
+          <w:b/>
+          <w:bCs/>
+        </w:rPr>
+        <w:t xml:space="preserve">Mala </w:t>
+      </w:r>
+      <w:proofErr w:type="spellStart"/>
+      <w:r>
+        <w:rPr>
+          <w:b/>
+          <w:bCs/>
+        </w:rPr>
+        <w:t>autocompletación</w:t>
+      </w:r>
+      <w:proofErr w:type="spellEnd"/>
+      <w:r>
+        <w:rPr>
+          <w:b/>
+          <w:bCs/>
+        </w:rPr>
+        <w:t xml:space="preserve">. </w:t>
+      </w:r>
+      <w:r>
+        <w:t xml:space="preserve">Por si mismo, </w:t>
+      </w:r>
+      <w:proofErr w:type="spellStart"/>
+      <w:r>
+        <w:t>VSCode</w:t>
+      </w:r>
+      <w:proofErr w:type="spellEnd"/>
+      <w:r>
+        <w:t xml:space="preserve"> no es muy eficiente a la hora de realizar sugerencias para el código en Java.</w:t>
+      </w:r>
+    </w:p>
+    <w:p/>
+    <w:p>
+      <w:pPr>
+        <w:pStyle w:val="Heading2"/>
         <w:numPr>
           <w:ilvl w:val="0"/>
           <w:numId w:val="1"/>
         </w:numPr>
       </w:pPr>
-      <w:bookmarkStart w:id="3" w:name="_Toc219454789"/>
-      <w:r>
-        <w:t>Instalación de Extensiones de</w:t>
-      </w:r>
-      <w:r>
-        <w:t xml:space="preserve"> Visual Studio </w:t>
-      </w:r>
-      <w:proofErr w:type="spellStart"/>
-      <w:r>
-        <w:t>Code</w:t>
+      <w:bookmarkStart w:id="3" w:name="_Toc219497650"/>
+      <w:r>
+        <w:t>Soluciones a través</w:t>
+      </w:r>
+      <w:r>
+        <w:t xml:space="preserve"> de Extensiones de</w:t>
+      </w:r>
+      <w:r>
+        <w:t xml:space="preserve"> Visual Studio Code</w:t>
       </w:r>
       <w:bookmarkEnd w:id="3"/>
-      <w:proofErr w:type="spellEnd"/>
     </w:p>
     <w:p/>
     <w:p>
       <w:r>
-        <w:t xml:space="preserve">Ahora vamos a realizar una instalación dentro de Visual Studio </w:t>
+        <w:t xml:space="preserve">Una de las grandes ventajas del IDE de </w:t>
       </w:r>
       <w:proofErr w:type="spellStart"/>
       <w:r>
-        <w:t>Code</w:t>
+        <w:t>VSCode</w:t>
       </w:r>
       <w:proofErr w:type="spellEnd"/>
       <w:r>
-        <w:t>, donde se nos pide realizar la instalación de l</w:t>
-      </w:r>
-      <w:r>
-        <w:t>a</w:t>
-      </w:r>
-      <w:r>
-        <w:t xml:space="preserve">s siguientes </w:t>
-      </w:r>
-      <w:r>
-        <w:t>extensiones</w:t>
-      </w:r>
-      <w:r>
-        <w:t>:</w:t>
+        <w:t xml:space="preserve">, es </w:t>
+      </w:r>
+      <w:r>
+        <w:t>que,</w:t>
+      </w:r>
+      <w:r>
+        <w:t xml:space="preserve"> debido a su intento de ser muy popular, es gratis y muy personalizable, por lo </w:t>
+      </w:r>
+      <w:r>
+        <w:t>que,</w:t>
+      </w:r>
+      <w:r>
+        <w:t xml:space="preserve"> aunque no sea perfecto para realizar Java por si mismo, las extensiones pueden cambiar est</w:t>
+      </w:r>
+      <w:r>
+        <w:t>a inconveniencia.</w:t>
       </w:r>
     </w:p>
     <w:p>
-      <w:pPr>
-        <w:pStyle w:val="Prrafodelista"/>
-        <w:numPr>
-          <w:ilvl w:val="0"/>
-          <w:numId w:val="4"/>
-        </w:numPr>
-      </w:pPr>
-      <w:r>
-        <w:t xml:space="preserve">Sprint </w:t>
-      </w:r>
-      <w:proofErr w:type="spellStart"/>
-      <w:r>
-        <w:t>Boot</w:t>
-      </w:r>
-      <w:proofErr w:type="spellEnd"/>
-      <w:r>
-        <w:t xml:space="preserve"> </w:t>
-      </w:r>
-      <w:proofErr w:type="spellStart"/>
-      <w:r>
-        <w:t>Initializer</w:t>
-      </w:r>
-      <w:proofErr w:type="spellEnd"/>
+      <w:r>
+        <w:t xml:space="preserve">Muchos desarrolladores alrededor del mundo programan en Java, por lo que no es impredecible descifrar que existen </w:t>
+      </w:r>
+      <w:r>
+        <w:t>extensiones o incluso más ya preparado para que las personas se puedan poner a programar en Java desde un primer comienzo.</w:t>
+      </w:r>
+    </w:p>
+    <w:p/>
+    <w:p>
+      <w:r>
+        <w:t>Este es el caso del siguiente pack de extensiones:</w:t>
+      </w:r>
     </w:p>
     <w:p>
-      <w:pPr>
-        <w:pStyle w:val="Prrafodelista"/>
-        <w:numPr>
-          <w:ilvl w:val="0"/>
-          <w:numId w:val="4"/>
-        </w:numPr>
-      </w:pPr>
-      <w:proofErr w:type="spellStart"/>
-      <w:r>
-        <w:t>Sprintboot</w:t>
-      </w:r>
-      <w:proofErr w:type="spellEnd"/>
       <w:r>
         <w:t xml:space="preserve"> </w:t>
       </w:r>
-      <w:proofErr w:type="spellStart"/>
-      <w:r>
-        <w:t>Dashboard</w:t>
-      </w:r>
-      <w:proofErr w:type="spellEnd"/>
-    </w:p>
-    <w:p>
-      <w:pPr>
-        <w:pStyle w:val="Prrafodelista"/>
-        <w:numPr>
-          <w:ilvl w:val="0"/>
-          <w:numId w:val="4"/>
-        </w:numPr>
-      </w:pPr>
-      <w:proofErr w:type="spellStart"/>
-      <w:r>
-        <w:t>Rainbow</w:t>
-      </w:r>
-      <w:proofErr w:type="spellEnd"/>
-      <w:r>
-        <w:t xml:space="preserve"> </w:t>
-      </w:r>
-      <w:proofErr w:type="spellStart"/>
-      <w:r>
-        <w:t>Indent</w:t>
-      </w:r>
-      <w:proofErr w:type="spellEnd"/>
-    </w:p>
-    <w:p>
-      <w:pPr>
-        <w:pStyle w:val="Prrafodelista"/>
-        <w:numPr>
-          <w:ilvl w:val="0"/>
-          <w:numId w:val="4"/>
-        </w:numPr>
-      </w:pPr>
-      <w:r>
-        <w:t>Live Share</w:t>
-      </w:r>
-    </w:p>
-    <w:p>
-      <w:r>
-        <w:t xml:space="preserve">Comenzamos primero navegando al apartado de extensiones de </w:t>
-      </w:r>
-      <w:proofErr w:type="spellStart"/>
-      <w:r>
-        <w:t>VSCode</w:t>
-      </w:r>
-      <w:proofErr w:type="spellEnd"/>
-    </w:p>
-    <w:p>
-      <w:pPr>
-        <w:jc w:val="left"/>
-      </w:pPr>
-      <w:r>
-        <w:rPr>
-          <w:noProof/>
-          <w:lang w:eastAsia="es-ES"/>
-        </w:rPr>
+      <w:r>
         <w:drawing>
-          <wp:inline distT="0" distB="0" distL="0" distR="0" wp14:anchorId="24416861" wp14:editId="7C4E0A8E">
-            <wp:extent cx="2695951" cy="2772162"/>
-            <wp:effectExtent l="0" t="0" r="9525" b="9525"/>
-            <wp:docPr id="10" name="Imagen 10"/>
+          <wp:inline distT="0" distB="0" distL="0" distR="0" wp14:anchorId="7DFD3FCC" wp14:editId="3AF8F49C">
+            <wp:extent cx="4876800" cy="2423488"/>
+            <wp:effectExtent l="0" t="0" r="0" b="0"/>
+            <wp:docPr id="2127053486" name="Picture 1" descr="A screenshot of a phone&#10;&#10;AI-generated content may be incorrect."/>
             <wp:cNvGraphicFramePr>
               <a:graphicFrameLocks xmlns:a="http://schemas.openxmlformats.org/drawingml/2006/main" noChangeAspect="1"/>
             </wp:cNvGraphicFramePr>
@@ -1265,7 +1362,7 @@
               <a:graphicData uri="http://schemas.openxmlformats.org/drawingml/2006/picture">
                 <pic:pic xmlns:pic="http://schemas.openxmlformats.org/drawingml/2006/picture">
                   <pic:nvPicPr>
-                    <pic:cNvPr id="1" name=""/>
+                    <pic:cNvPr id="2127053486" name="Picture 1" descr="A screenshot of a phone&#10;&#10;AI-generated content may be incorrect."/>
                     <pic:cNvPicPr/>
                   </pic:nvPicPr>
                   <pic:blipFill>
@@ -1277,7 +1374,7 @@
                   <pic:spPr>
                     <a:xfrm>
                       <a:off x="0" y="0"/>
-                      <a:ext cx="2695951" cy="2772162"/>
+                      <a:ext cx="4905711" cy="2437855"/>
                     </a:xfrm>
                     <a:prstGeom prst="rect">
                       <a:avLst/>
@@ -1290,66 +1387,41 @@
         </w:drawing>
       </w:r>
     </w:p>
-    <w:p/>
     <w:p>
-      <w:pPr>
-        <w:rPr>
-          <w:lang w:val="en-GB"/>
-        </w:rPr>
-      </w:pPr>
+      <w:r>
+        <w:lastRenderedPageBreak/>
+        <w:t xml:space="preserve">Como se puede ver, existen una alta cantidad de este tipo de archivos, y uno de los que más nos podría interesar es el de Microsoft, </w:t>
+      </w:r>
+      <w:r>
+        <w:t>“</w:t>
+      </w:r>
       <w:proofErr w:type="spellStart"/>
       <w:r>
-        <w:rPr>
-          <w:lang w:val="en-GB"/>
-        </w:rPr>
-        <w:t>Empezamos</w:t>
+        <w:t>Extension</w:t>
       </w:r>
       <w:proofErr w:type="spellEnd"/>
       <w:r>
-        <w:rPr>
-          <w:lang w:val="en-GB"/>
-        </w:rPr>
-        <w:t xml:space="preserve"> </w:t>
+        <w:t xml:space="preserve"> Pack </w:t>
       </w:r>
       <w:proofErr w:type="spellStart"/>
       <w:r>
-        <w:rPr>
-          <w:lang w:val="en-GB"/>
-        </w:rPr>
-        <w:t>buscando</w:t>
+        <w:t>for</w:t>
       </w:r>
       <w:proofErr w:type="spellEnd"/>
       <w:r>
-        <w:rPr>
-          <w:lang w:val="en-GB"/>
-        </w:rPr>
-        <w:t xml:space="preserve"> Spring Boot Initialize</w:t>
-      </w:r>
-      <w:r>
-        <w:rPr>
-          <w:lang w:val="en-GB"/>
-        </w:rPr>
-        <w:t>r.</w:t>
+        <w:t xml:space="preserve"> Java”, con 40 millones de descargas, </w:t>
+      </w:r>
+      <w:r>
+        <w:t>que viene como un conjunto de diferentes extensiones unidas en una las cuales son las siguientes:</w:t>
       </w:r>
     </w:p>
     <w:p>
-      <w:pPr>
-        <w:jc w:val="center"/>
-        <w:rPr>
-          <w:lang w:val="en-GB"/>
-        </w:rPr>
-      </w:pPr>
-      <w:r>
-        <w:rPr>
-          <w:noProof/>
-          <w:lang w:eastAsia="es-ES"/>
-        </w:rPr>
-        <w:lastRenderedPageBreak/>
+      <w:r>
         <w:drawing>
-          <wp:inline distT="0" distB="0" distL="0" distR="0" wp14:anchorId="58F7E810" wp14:editId="398E9F08">
-            <wp:extent cx="5400040" cy="1486535"/>
-            <wp:effectExtent l="0" t="0" r="0" b="0"/>
-            <wp:docPr id="11" name="Imagen 11"/>
+          <wp:inline distT="0" distB="0" distL="0" distR="0" wp14:anchorId="6099E21A" wp14:editId="5A17629C">
+            <wp:extent cx="5400040" cy="4758690"/>
+            <wp:effectExtent l="0" t="0" r="0" b="3810"/>
+            <wp:docPr id="804964516" name="Picture 1" descr="A screenshot of a computer program&#10;&#10;AI-generated content may be incorrect."/>
             <wp:cNvGraphicFramePr>
               <a:graphicFrameLocks xmlns:a="http://schemas.openxmlformats.org/drawingml/2006/main" noChangeAspect="1"/>
             </wp:cNvGraphicFramePr>
@@ -1357,7 +1429,7 @@
               <a:graphicData uri="http://schemas.openxmlformats.org/drawingml/2006/picture">
                 <pic:pic xmlns:pic="http://schemas.openxmlformats.org/drawingml/2006/picture">
                   <pic:nvPicPr>
-                    <pic:cNvPr id="1" name=""/>
+                    <pic:cNvPr id="804964516" name="Picture 1" descr="A screenshot of a computer program&#10;&#10;AI-generated content may be incorrect."/>
                     <pic:cNvPicPr/>
                   </pic:nvPicPr>
                   <pic:blipFill>
@@ -1369,7 +1441,7 @@
                   <pic:spPr>
                     <a:xfrm>
                       <a:off x="0" y="0"/>
-                      <a:ext cx="5400040" cy="1486535"/>
+                      <a:ext cx="5400040" cy="4758690"/>
                     </a:xfrm>
                     <a:prstGeom prst="rect">
                       <a:avLst/>
@@ -1382,99 +1454,88 @@
         </w:drawing>
       </w:r>
     </w:p>
+    <w:p/>
     <w:p>
       <w:r>
-        <w:t>Con 5.8 millones de descargas, e</w:t>
-      </w:r>
-      <w:r>
-        <w:t xml:space="preserve">n nombre que aparece como segundo resultado de búsqueda, Spring </w:t>
+        <w:t xml:space="preserve">Tal como dice en su descripción, ayuda tanto en la navegación de código, como su </w:t>
       </w:r>
       <w:proofErr w:type="spellStart"/>
       <w:r>
-        <w:t>Initializr</w:t>
+        <w:t>autocompletación</w:t>
       </w:r>
       <w:proofErr w:type="spellEnd"/>
       <w:r>
-        <w:t xml:space="preserve"> es la extensión que nosotros estamos buscando, y, además, como bono, Spring </w:t>
-      </w:r>
-      <w:proofErr w:type="spellStart"/>
-      <w:r>
-        <w:t>Boot</w:t>
-      </w:r>
-      <w:proofErr w:type="spellEnd"/>
-      <w:r>
-        <w:t xml:space="preserve"> </w:t>
-      </w:r>
-      <w:proofErr w:type="spellStart"/>
-      <w:r>
-        <w:t>Dashboard</w:t>
-      </w:r>
-      <w:proofErr w:type="spellEnd"/>
-      <w:r>
-        <w:t xml:space="preserve"> nos sale como la primera opción también, por lo que podemos instalar ambos de una sola pasada.</w:t>
+        <w:t>, y como su corrección de errores o refactorización.</w:t>
       </w:r>
     </w:p>
     <w:p>
-      <w:pPr>
-        <w:jc w:val="center"/>
-      </w:pPr>
-      <w:r>
-        <w:rPr>
-          <w:noProof/>
-          <w:lang w:eastAsia="es-ES"/>
-        </w:rPr>
-        <w:drawing>
-          <wp:inline distT="0" distB="0" distL="0" distR="0" wp14:anchorId="2F77BAFE" wp14:editId="1F4D67E2">
-            <wp:extent cx="5400040" cy="1235075"/>
-            <wp:effectExtent l="0" t="0" r="0" b="3175"/>
-            <wp:docPr id="12" name="Imagen 12"/>
-            <wp:cNvGraphicFramePr>
-              <a:graphicFrameLocks xmlns:a="http://schemas.openxmlformats.org/drawingml/2006/main" noChangeAspect="1"/>
-            </wp:cNvGraphicFramePr>
-            <a:graphic xmlns:a="http://schemas.openxmlformats.org/drawingml/2006/main">
-              <a:graphicData uri="http://schemas.openxmlformats.org/drawingml/2006/picture">
-                <pic:pic xmlns:pic="http://schemas.openxmlformats.org/drawingml/2006/picture">
-                  <pic:nvPicPr>
-                    <pic:cNvPr id="1" name=""/>
-                    <pic:cNvPicPr/>
-                  </pic:nvPicPr>
-                  <pic:blipFill>
-                    <a:blip r:embed="rId13"/>
-                    <a:stretch>
-                      <a:fillRect/>
-                    </a:stretch>
-                  </pic:blipFill>
-                  <pic:spPr>
-                    <a:xfrm>
-                      <a:off x="0" y="0"/>
-                      <a:ext cx="5400040" cy="1235075"/>
-                    </a:xfrm>
-                    <a:prstGeom prst="rect">
-                      <a:avLst/>
-                    </a:prstGeom>
-                  </pic:spPr>
-                </pic:pic>
-              </a:graphicData>
-            </a:graphic>
-          </wp:inline>
-        </w:drawing>
+      <w:r>
+        <w:t xml:space="preserve">Este de aquí, además, da soporte a Maven, </w:t>
+      </w:r>
+      <w:r>
+        <w:t xml:space="preserve">un constructor de código por el cual </w:t>
+      </w:r>
+      <w:r>
+        <w:t>los proyectos muy grandes que se suelen hacer en Java</w:t>
+      </w:r>
+      <w:r>
+        <w:t xml:space="preserve"> lo suel</w:t>
+      </w:r>
+      <w:r>
+        <w:t>e</w:t>
+      </w:r>
+      <w:r>
+        <w:t>n</w:t>
+      </w:r>
+      <w:r>
+        <w:t xml:space="preserve"> requer</w:t>
+      </w:r>
+      <w:r>
+        <w:t>ir, y</w:t>
+      </w:r>
+      <w:r>
+        <w:t xml:space="preserve"> de un alto soporte de los IDE para poder </w:t>
+      </w:r>
+      <w:r>
+        <w:t>usarlos</w:t>
+      </w:r>
+      <w:r>
+        <w:t>.</w:t>
+      </w:r>
+      <w:r>
+        <w:t xml:space="preserve"> Puede gestionar las dependencias de los archivos de Java </w:t>
+      </w:r>
+      <w:r>
+        <w:t>(sus librerías) así como sus compilaciones.</w:t>
       </w:r>
     </w:p>
     <w:p>
       <w:r>
-        <w:t xml:space="preserve">Con dichas extensiones instaladas, nos queda buscar ahora por </w:t>
+        <w:t xml:space="preserve">Aparte de esta, que de por sí cubre todos esos problemas y prepara, tanto con cosas desarrolladas por Microsoft como por otros desarrolladores como Red </w:t>
       </w:r>
       <w:proofErr w:type="spellStart"/>
       <w:r>
-        <w:t>Rainbow</w:t>
+        <w:t>Hat</w:t>
       </w:r>
       <w:proofErr w:type="spellEnd"/>
       <w:r>
-        <w:t xml:space="preserve"> </w:t>
+        <w:t>, otr</w:t>
+      </w:r>
+      <w:r>
+        <w:t>a</w:t>
+      </w:r>
+      <w:r>
+        <w:t xml:space="preserve">s </w:t>
+      </w:r>
+      <w:r>
+        <w:t>extensiones</w:t>
+      </w:r>
+      <w:r>
+        <w:t xml:space="preserve"> que son gustados para la programación en Java, como </w:t>
       </w:r>
       <w:proofErr w:type="spellStart"/>
       <w:r>
-        <w:t>Indent</w:t>
+        <w:t>IntelliCode</w:t>
       </w:r>
       <w:proofErr w:type="spellEnd"/>
       <w:r>
@@ -1482,230 +1543,45 @@
       </w:r>
     </w:p>
     <w:p>
-      <w:pPr>
-        <w:jc w:val="center"/>
-      </w:pPr>
-      <w:r>
-        <w:rPr>
-          <w:noProof/>
-          <w:lang w:eastAsia="es-ES"/>
-        </w:rPr>
-        <w:drawing>
-          <wp:inline distT="0" distB="0" distL="0" distR="0" wp14:anchorId="7797191F" wp14:editId="7AABBA29">
-            <wp:extent cx="5400040" cy="1616710"/>
-            <wp:effectExtent l="0" t="0" r="0" b="2540"/>
-            <wp:docPr id="13" name="Imagen 13"/>
-            <wp:cNvGraphicFramePr>
-              <a:graphicFrameLocks xmlns:a="http://schemas.openxmlformats.org/drawingml/2006/main" noChangeAspect="1"/>
-            </wp:cNvGraphicFramePr>
-            <a:graphic xmlns:a="http://schemas.openxmlformats.org/drawingml/2006/main">
-              <a:graphicData uri="http://schemas.openxmlformats.org/drawingml/2006/picture">
-                <pic:pic xmlns:pic="http://schemas.openxmlformats.org/drawingml/2006/picture">
-                  <pic:nvPicPr>
-                    <pic:cNvPr id="1" name=""/>
-                    <pic:cNvPicPr/>
-                  </pic:nvPicPr>
-                  <pic:blipFill>
-                    <a:blip r:embed="rId14"/>
-                    <a:stretch>
-                      <a:fillRect/>
-                    </a:stretch>
-                  </pic:blipFill>
-                  <pic:spPr>
-                    <a:xfrm>
-                      <a:off x="0" y="0"/>
-                      <a:ext cx="5400040" cy="1616710"/>
-                    </a:xfrm>
-                    <a:prstGeom prst="rect">
-                      <a:avLst/>
-                    </a:prstGeom>
-                  </pic:spPr>
-                </pic:pic>
-              </a:graphicData>
-            </a:graphic>
-          </wp:inline>
-        </w:drawing>
-      </w:r>
+      <w:hyperlink r:id="rId13" w:history="1">
+        <w:r>
+          <w:rPr>
+            <w:rStyle w:val="Hyperlink"/>
+          </w:rPr>
+          <w:t>https://marketplace.visualstudio.com/items?itemName=VisualStudioExptTeam.vscodeintellicode</w:t>
+        </w:r>
+      </w:hyperlink>
     </w:p>
     <w:p>
       <w:r>
-        <w:t>Una vez encontrado, solo queda darle a instalar.</w:t>
+        <w:t xml:space="preserve">Y Spring Boot </w:t>
+      </w:r>
+      <w:r>
+        <w:t>extensión</w:t>
+      </w:r>
+      <w:r>
+        <w:t xml:space="preserve"> Pack</w:t>
+      </w:r>
+      <w:r>
+        <w:t xml:space="preserve"> que hemos instalado</w:t>
+      </w:r>
+      <w:r>
+        <w:t xml:space="preserve"> en prácticas anteriores para proyectos de </w:t>
+      </w:r>
+      <w:proofErr w:type="spellStart"/>
+      <w:r>
+        <w:t>Backend</w:t>
+      </w:r>
+      <w:proofErr w:type="spellEnd"/>
+      <w:r>
+        <w:t xml:space="preserve"> especialmente.</w:t>
       </w:r>
     </w:p>
     <w:p>
-      <w:r>
-        <w:rPr>
-          <w:noProof/>
-          <w:lang w:eastAsia="es-ES"/>
-        </w:rPr>
-        <w:drawing>
-          <wp:anchor distT="0" distB="0" distL="114300" distR="114300" simplePos="0" relativeHeight="251662336" behindDoc="0" locked="0" layoutInCell="1" allowOverlap="1" wp14:anchorId="2911B97F" wp14:editId="280607B1">
-            <wp:simplePos x="0" y="0"/>
-            <wp:positionH relativeFrom="margin">
-              <wp:posOffset>-659</wp:posOffset>
-            </wp:positionH>
-            <wp:positionV relativeFrom="paragraph">
-              <wp:posOffset>-33823</wp:posOffset>
-            </wp:positionV>
-            <wp:extent cx="3830955" cy="2320290"/>
-            <wp:effectExtent l="0" t="0" r="0" b="3810"/>
-            <wp:wrapSquare wrapText="bothSides"/>
-            <wp:docPr id="15" name="Imagen 15"/>
-            <wp:cNvGraphicFramePr>
-              <a:graphicFrameLocks xmlns:a="http://schemas.openxmlformats.org/drawingml/2006/main" noChangeAspect="1"/>
-            </wp:cNvGraphicFramePr>
-            <a:graphic xmlns:a="http://schemas.openxmlformats.org/drawingml/2006/main">
-              <a:graphicData uri="http://schemas.openxmlformats.org/drawingml/2006/picture">
-                <pic:pic xmlns:pic="http://schemas.openxmlformats.org/drawingml/2006/picture">
-                  <pic:nvPicPr>
-                    <pic:cNvPr id="1" name=""/>
-                    <pic:cNvPicPr/>
-                  </pic:nvPicPr>
-                  <pic:blipFill>
-                    <a:blip r:embed="rId15">
-                      <a:extLst>
-                        <a:ext uri="{28A0092B-C50C-407E-A947-70E740481C1C}">
-                          <a14:useLocalDpi xmlns:a14="http://schemas.microsoft.com/office/drawing/2010/main" val="0"/>
-                        </a:ext>
-                      </a:extLst>
-                    </a:blip>
-                    <a:stretch>
-                      <a:fillRect/>
-                    </a:stretch>
-                  </pic:blipFill>
-                  <pic:spPr>
-                    <a:xfrm>
-                      <a:off x="0" y="0"/>
-                      <a:ext cx="3830955" cy="2320290"/>
-                    </a:xfrm>
-                    <a:prstGeom prst="rect">
-                      <a:avLst/>
-                    </a:prstGeom>
-                  </pic:spPr>
-                </pic:pic>
-              </a:graphicData>
-            </a:graphic>
-          </wp:anchor>
-        </w:drawing>
-      </w:r>
-      <w:r>
-        <w:t>Cabe mencionar que nos sale un aviso para instalar esta extensión, ya que en este caso Microsoft no es el publicador, pero, sin embargo, también es importante aclarar que, de todas formas, este tiene 11.8 millones de instalaciones.</w:t>
-      </w:r>
-    </w:p>
-    <w:p/>
-    <w:p>
-      <w:r>
-        <w:lastRenderedPageBreak/>
-        <w:t>Una vez instalada, nos queda por instalar Live Share, otra aplicación de Microsoft con 22 millones de descargas, por lo que no hay mayor complicación que simplemente darle a descargar.</w:t>
-      </w:r>
-    </w:p>
-    <w:p>
-      <w:pPr>
-        <w:jc w:val="center"/>
-      </w:pPr>
-      <w:r>
-        <w:rPr>
-          <w:noProof/>
-          <w:lang w:eastAsia="es-ES"/>
-        </w:rPr>
-        <w:drawing>
-          <wp:inline distT="0" distB="0" distL="0" distR="0" wp14:anchorId="0A61E0E1" wp14:editId="67FCC777">
-            <wp:extent cx="5400040" cy="762635"/>
-            <wp:effectExtent l="0" t="0" r="0" b="0"/>
-            <wp:docPr id="16" name="Imagen 16"/>
-            <wp:cNvGraphicFramePr>
-              <a:graphicFrameLocks xmlns:a="http://schemas.openxmlformats.org/drawingml/2006/main" noChangeAspect="1"/>
-            </wp:cNvGraphicFramePr>
-            <a:graphic xmlns:a="http://schemas.openxmlformats.org/drawingml/2006/main">
-              <a:graphicData uri="http://schemas.openxmlformats.org/drawingml/2006/picture">
-                <pic:pic xmlns:pic="http://schemas.openxmlformats.org/drawingml/2006/picture">
-                  <pic:nvPicPr>
-                    <pic:cNvPr id="1" name=""/>
-                    <pic:cNvPicPr/>
-                  </pic:nvPicPr>
-                  <pic:blipFill>
-                    <a:blip r:embed="rId16"/>
-                    <a:stretch>
-                      <a:fillRect/>
-                    </a:stretch>
-                  </pic:blipFill>
-                  <pic:spPr>
-                    <a:xfrm>
-                      <a:off x="0" y="0"/>
-                      <a:ext cx="5400040" cy="762635"/>
-                    </a:xfrm>
-                    <a:prstGeom prst="rect">
-                      <a:avLst/>
-                    </a:prstGeom>
-                  </pic:spPr>
-                </pic:pic>
-              </a:graphicData>
-            </a:graphic>
-          </wp:inline>
-        </w:drawing>
-      </w:r>
-    </w:p>
-    <w:p>
-      <w:r>
-        <w:t>Y como verificamos posteriormente, las extensiones están aplicadas de forma correcta.</w:t>
-      </w:r>
-    </w:p>
-    <w:p>
-      <w:pPr>
-        <w:jc w:val="left"/>
-      </w:pPr>
-      <w:r>
-        <w:rPr>
-          <w:noProof/>
-          <w:lang w:eastAsia="es-ES"/>
-        </w:rPr>
-        <w:drawing>
-          <wp:inline distT="0" distB="0" distL="0" distR="0" wp14:anchorId="677D151E" wp14:editId="44A00786">
-            <wp:extent cx="1800476" cy="3229426"/>
-            <wp:effectExtent l="0" t="0" r="9525" b="9525"/>
-            <wp:docPr id="17" name="Imagen 17"/>
-            <wp:cNvGraphicFramePr>
-              <a:graphicFrameLocks xmlns:a="http://schemas.openxmlformats.org/drawingml/2006/main" noChangeAspect="1"/>
-            </wp:cNvGraphicFramePr>
-            <a:graphic xmlns:a="http://schemas.openxmlformats.org/drawingml/2006/main">
-              <a:graphicData uri="http://schemas.openxmlformats.org/drawingml/2006/picture">
-                <pic:pic xmlns:pic="http://schemas.openxmlformats.org/drawingml/2006/picture">
-                  <pic:nvPicPr>
-                    <pic:cNvPr id="1" name=""/>
-                    <pic:cNvPicPr/>
-                  </pic:nvPicPr>
-                  <pic:blipFill>
-                    <a:blip r:embed="rId17"/>
-                    <a:stretch>
-                      <a:fillRect/>
-                    </a:stretch>
-                  </pic:blipFill>
-                  <pic:spPr>
-                    <a:xfrm>
-                      <a:off x="0" y="0"/>
-                      <a:ext cx="1800476" cy="3229426"/>
-                    </a:xfrm>
-                    <a:prstGeom prst="rect">
-                      <a:avLst/>
-                    </a:prstGeom>
-                  </pic:spPr>
-                </pic:pic>
-              </a:graphicData>
-            </a:graphic>
-          </wp:inline>
-        </w:drawing>
-      </w:r>
-    </w:p>
-    <w:p>
-      <w:r>
-        <w:br w:type="page"/>
-      </w:r>
-    </w:p>
-    <w:p>
-      <w:pPr>
-        <w:pStyle w:val="Ttulo1"/>
-      </w:pPr>
-      <w:bookmarkStart w:id="4" w:name="_Toc219454790"/>
+      <w:pPr>
+        <w:pStyle w:val="Heading1"/>
+      </w:pPr>
+      <w:bookmarkStart w:id="4" w:name="_Toc219497651"/>
       <w:r>
         <w:lastRenderedPageBreak/>
         <w:t>Conclusiones</w:t>
@@ -1715,44 +1591,47 @@
     <w:p/>
     <w:p>
       <w:r>
-        <w:t xml:space="preserve">Las mejoras de </w:t>
+        <w:t xml:space="preserve">Una vez ya entendido cuales son los problemas actuales con </w:t>
       </w:r>
       <w:proofErr w:type="spellStart"/>
       <w:r>
-        <w:t>IntelliJ</w:t>
+        <w:t>VSCode</w:t>
       </w:r>
       <w:proofErr w:type="spellEnd"/>
       <w:r>
-        <w:t xml:space="preserve"> especialmente a través de la búsqueda de </w:t>
+        <w:t xml:space="preserve"> y por qué se necesitan extensiones para este, hemos realizado un vistazo sobre las necesidades actuales de </w:t>
       </w:r>
       <w:proofErr w:type="spellStart"/>
       <w:r>
-        <w:t>plugins</w:t>
+        <w:t>VSCode</w:t>
       </w:r>
       <w:proofErr w:type="spellEnd"/>
       <w:r>
-        <w:t xml:space="preserve"> han servido como un agente que ha dado pie a buscar más extensiones que hagan trabajar dentro de estas algo más cómodo, y por esto, incluso cuando la actividad solo sea la de instalar un solo </w:t>
+        <w:t xml:space="preserve"> para programar bien en Java, </w:t>
+      </w:r>
+      <w:r>
+        <w:t xml:space="preserve">y, junto a esas, hemos podido hacer una selección fuerte de varios packs de extensiones (lo que juntas llegan a casi 10), para poder programar de forma cómoda en Java con </w:t>
       </w:r>
       <w:proofErr w:type="spellStart"/>
       <w:r>
-        <w:t>plugin</w:t>
+        <w:t>VSCode</w:t>
       </w:r>
       <w:proofErr w:type="spellEnd"/>
       <w:r>
-        <w:t>, he instalado múltiples más por mi propia cuenta.</w:t>
+        <w:t>.</w:t>
       </w:r>
     </w:p>
     <w:p>
       <w:r>
-        <w:t xml:space="preserve">Para las extensiones de </w:t>
+        <w:t xml:space="preserve">Obviamente, no se cabe descartar que se pueden seguir añadiendo más y más detalles, pero con estas extensiones, ya es suficiente para cubrir los aspectos básicos e incluso moderados o de </w:t>
       </w:r>
       <w:proofErr w:type="spellStart"/>
       <w:r>
-        <w:t>VSCode</w:t>
+        <w:t>backend</w:t>
       </w:r>
       <w:proofErr w:type="spellEnd"/>
       <w:r>
-        <w:t>, no hay mucho que añadir, sin embargo, ya que son simplemente cuatro extensiones a instalar y ya.</w:t>
+        <w:t>.</w:t>
       </w:r>
     </w:p>
     <w:p>
@@ -1762,9 +1641,9 @@
     </w:p>
     <w:p>
       <w:pPr>
-        <w:pStyle w:val="Ttulo1"/>
-      </w:pPr>
-      <w:bookmarkStart w:id="5" w:name="_Toc219454791"/>
+        <w:pStyle w:val="Heading1"/>
+      </w:pPr>
+      <w:bookmarkStart w:id="5" w:name="_Toc219497652"/>
       <w:r>
         <w:lastRenderedPageBreak/>
         <w:t>Bibliografía</w:t>
@@ -1774,18 +1653,36 @@
     <w:p/>
     <w:p>
       <w:pPr>
-        <w:pStyle w:val="Prrafodelista"/>
+        <w:pStyle w:val="ListParagraph"/>
         <w:numPr>
           <w:ilvl w:val="0"/>
-          <w:numId w:val="2"/>
+          <w:numId w:val="4"/>
         </w:numPr>
       </w:pPr>
-      <w:hyperlink r:id="rId18" w:history="1">
+      <w:hyperlink r:id="rId14" w:history="1">
         <w:r>
           <w:rPr>
-            <w:rStyle w:val="Hipervnculo"/>
+            <w:rStyle w:val="Hyperlink"/>
           </w:rPr>
-          <w:t>https://marketplace.visualstudio.com/search?term=spring%20boot%20initializer&amp;target=VSCode&amp;category=All%20categories&amp;sortBy=Relevance</w:t>
+          <w:t>https://www.techbloat.com/how-to-run-ja</w:t>
+        </w:r>
+        <w:r>
+          <w:rPr>
+            <w:rStyle w:val="Hyperlink"/>
+          </w:rPr>
+          <w:t>v</w:t>
+        </w:r>
+        <w:r>
+          <w:rPr>
+            <w:rStyle w:val="Hyperlink"/>
+          </w:rPr>
+          <w:t>a-in-vs-code</w:t>
+        </w:r>
+        <w:r>
+          <w:rPr>
+            <w:rStyle w:val="Hyperlink"/>
+          </w:rPr>
+          <w:t>.html</w:t>
         </w:r>
       </w:hyperlink>
       <w:r>
@@ -1794,12 +1691,46 @@
     </w:p>
     <w:p>
       <w:pPr>
-        <w:ind w:left="360"/>
+        <w:pStyle w:val="ListParagraph"/>
+        <w:numPr>
+          <w:ilvl w:val="0"/>
+          <w:numId w:val="4"/>
+        </w:numPr>
+      </w:pPr>
+      <w:hyperlink r:id="rId15" w:history="1">
+        <w:r>
+          <w:rPr>
+            <w:rStyle w:val="Hyperlink"/>
+          </w:rPr>
+          <w:t>https://keepcoding.io/blog/como-usar-java-en-visual-studio-code/</w:t>
+        </w:r>
+      </w:hyperlink>
+    </w:p>
+    <w:p>
+      <w:pPr>
+        <w:pStyle w:val="ListParagraph"/>
+        <w:numPr>
+          <w:ilvl w:val="0"/>
+          <w:numId w:val="4"/>
+        </w:numPr>
+      </w:pPr>
+      <w:hyperlink r:id="rId16" w:history="1">
+        <w:r>
+          <w:rPr>
+            <w:rStyle w:val="Hyperlink"/>
+          </w:rPr>
+          <w:t>https://smallusefultips.com/is-visual-studio-code-good-for-java/</w:t>
+        </w:r>
+      </w:hyperlink>
+    </w:p>
+    <w:p>
+      <w:pPr>
+        <w:pStyle w:val="ListParagraph"/>
       </w:pPr>
     </w:p>
     <w:sectPr>
-      <w:headerReference w:type="default" r:id="rId19"/>
-      <w:footerReference w:type="default" r:id="rId20"/>
+      <w:headerReference w:type="default" r:id="rId17"/>
+      <w:footerReference w:type="default" r:id="rId18"/>
       <w:pgSz w:w="11906" w:h="16838"/>
       <w:pgMar w:top="1417" w:right="1701" w:bottom="1417" w:left="1701" w:header="708" w:footer="708" w:gutter="0"/>
       <w:pgNumType w:start="0"/>
@@ -1812,7 +1743,7 @@
 </file>
 
 <file path=word/endnotes.xml><?xml version="1.0" encoding="utf-8"?>
-<w:endnotes xmlns:wpc="http://schemas.microsoft.com/office/word/2010/wordprocessingCanvas" xmlns:cx="http://schemas.microsoft.com/office/drawing/2014/chartex" xmlns:mc="http://schemas.openxmlformats.org/markup-compatibility/2006" xmlns:o="urn:schemas-microsoft-com:office:office" xmlns:r="http://schemas.openxmlformats.org/officeDocument/2006/relationships" xmlns:m="http://schemas.openxmlformats.org/officeDocument/2006/math" xmlns:v="urn:schemas-microsoft-com:vml" xmlns:wp14="http://schemas.microsoft.com/office/word/2010/wordprocessingDrawing" xmlns:wp="http://schemas.openxmlformats.org/drawingml/2006/wordprocessingDrawing" xmlns:w10="urn:schemas-microsoft-com:office:word" xmlns:w="http://schemas.openxmlformats.org/wordprocessingml/2006/main" xmlns:w14="http://schemas.microsoft.com/office/word/2010/wordml" xmlns:w15="http://schemas.microsoft.com/office/word/2012/wordml" xmlns:w16se="http://schemas.microsoft.com/office/word/2015/wordml/symex" xmlns:wpg="http://schemas.microsoft.com/office/word/2010/wordprocessingGroup" xmlns:wpi="http://schemas.microsoft.com/office/word/2010/wordprocessingInk" xmlns:wne="http://schemas.microsoft.com/office/word/2006/wordml" xmlns:wps="http://schemas.microsoft.com/office/word/2010/wordprocessingShape" mc:Ignorable="w14 w15 w16se wp14">
+<w:endnotes xmlns:wpc="http://schemas.microsoft.com/office/word/2010/wordprocessingCanvas" xmlns:cx="http://schemas.microsoft.com/office/drawing/2014/chartex" xmlns:cx1="http://schemas.microsoft.com/office/drawing/2015/9/8/chartex" xmlns:cx2="http://schemas.microsoft.com/office/drawing/2015/10/21/chartex" xmlns:cx3="http://schemas.microsoft.com/office/drawing/2016/5/9/chartex" xmlns:cx4="http://schemas.microsoft.com/office/drawing/2016/5/10/chartex" xmlns:cx5="http://schemas.microsoft.com/office/drawing/2016/5/11/chartex" xmlns:cx6="http://schemas.microsoft.com/office/drawing/2016/5/12/chartex" xmlns:cx7="http://schemas.microsoft.com/office/drawing/2016/5/13/chartex" xmlns:cx8="http://schemas.microsoft.com/office/drawing/2016/5/14/chartex" xmlns:mc="http://schemas.openxmlformats.org/markup-compatibility/2006" xmlns:aink="http://schemas.microsoft.com/office/drawing/2016/ink" xmlns:am3d="http://schemas.microsoft.com/office/drawing/2017/model3d" xmlns:o="urn:schemas-microsoft-com:office:office" xmlns:oel="http://schemas.microsoft.com/office/2019/extlst" xmlns:r="http://schemas.openxmlformats.org/officeDocument/2006/relationships" xmlns:m="http://schemas.openxmlformats.org/officeDocument/2006/math" xmlns:v="urn:schemas-microsoft-com:vml" xmlns:wp14="http://schemas.microsoft.com/office/word/2010/wordprocessingDrawing" xmlns:wp="http://schemas.openxmlformats.org/drawingml/2006/wordprocessingDrawing" xmlns:w10="urn:schemas-microsoft-com:office:word" xmlns:w="http://schemas.openxmlformats.org/wordprocessingml/2006/main" xmlns:w14="http://schemas.microsoft.com/office/word/2010/wordml" xmlns:w15="http://schemas.microsoft.com/office/word/2012/wordml" xmlns:w16cex="http://schemas.microsoft.com/office/word/2018/wordml/cex" xmlns:w16cid="http://schemas.microsoft.com/office/word/2016/wordml/cid" xmlns:w16="http://schemas.microsoft.com/office/word/2018/wordml" xmlns:w16du="http://schemas.microsoft.com/office/word/2023/wordml/word16du" xmlns:w16sdtdh="http://schemas.microsoft.com/office/word/2020/wordml/sdtdatahash" xmlns:w16sdtfl="http://schemas.microsoft.com/office/word/2024/wordml/sdtformatlock" xmlns:w16se="http://schemas.microsoft.com/office/word/2015/wordml/symex" xmlns:wpg="http://schemas.microsoft.com/office/word/2010/wordprocessingGroup" xmlns:wpi="http://schemas.microsoft.com/office/word/2010/wordprocessingInk" xmlns:wne="http://schemas.microsoft.com/office/word/2006/wordml" xmlns:wps="http://schemas.microsoft.com/office/word/2010/wordprocessingShape" mc:Ignorable="w14 w15 w16se w16cid w16 w16cex w16sdtdh w16sdtfl w16du wp14">
   <w:endnote w:type="separator" w:id="-1">
     <w:p>
       <w:pPr>
@@ -1837,7 +1768,7 @@
 </file>
 
 <file path=word/footer1.xml><?xml version="1.0" encoding="utf-8"?>
-<w:ftr xmlns:wpc="http://schemas.microsoft.com/office/word/2010/wordprocessingCanvas" xmlns:cx="http://schemas.microsoft.com/office/drawing/2014/chartex" xmlns:mc="http://schemas.openxmlformats.org/markup-compatibility/2006" xmlns:o="urn:schemas-microsoft-com:office:office" xmlns:r="http://schemas.openxmlformats.org/officeDocument/2006/relationships" xmlns:m="http://schemas.openxmlformats.org/officeDocument/2006/math" xmlns:v="urn:schemas-microsoft-com:vml" xmlns:wp14="http://schemas.microsoft.com/office/word/2010/wordprocessingDrawing" xmlns:wp="http://schemas.openxmlformats.org/drawingml/2006/wordprocessingDrawing" xmlns:w10="urn:schemas-microsoft-com:office:word" xmlns:w="http://schemas.openxmlformats.org/wordprocessingml/2006/main" xmlns:w14="http://schemas.microsoft.com/office/word/2010/wordml" xmlns:w15="http://schemas.microsoft.com/office/word/2012/wordml" xmlns:w16se="http://schemas.microsoft.com/office/word/2015/wordml/symex" xmlns:wpg="http://schemas.microsoft.com/office/word/2010/wordprocessingGroup" xmlns:wpi="http://schemas.microsoft.com/office/word/2010/wordprocessingInk" xmlns:wne="http://schemas.microsoft.com/office/word/2006/wordml" xmlns:wps="http://schemas.microsoft.com/office/word/2010/wordprocessingShape" mc:Ignorable="w14 w15 w16se wp14">
+<w:ftr xmlns:wpc="http://schemas.microsoft.com/office/word/2010/wordprocessingCanvas" xmlns:cx="http://schemas.microsoft.com/office/drawing/2014/chartex" xmlns:cx1="http://schemas.microsoft.com/office/drawing/2015/9/8/chartex" xmlns:cx2="http://schemas.microsoft.com/office/drawing/2015/10/21/chartex" xmlns:cx3="http://schemas.microsoft.com/office/drawing/2016/5/9/chartex" xmlns:cx4="http://schemas.microsoft.com/office/drawing/2016/5/10/chartex" xmlns:cx5="http://schemas.microsoft.com/office/drawing/2016/5/11/chartex" xmlns:cx6="http://schemas.microsoft.com/office/drawing/2016/5/12/chartex" xmlns:cx7="http://schemas.microsoft.com/office/drawing/2016/5/13/chartex" xmlns:cx8="http://schemas.microsoft.com/office/drawing/2016/5/14/chartex" xmlns:mc="http://schemas.openxmlformats.org/markup-compatibility/2006" xmlns:aink="http://schemas.microsoft.com/office/drawing/2016/ink" xmlns:am3d="http://schemas.microsoft.com/office/drawing/2017/model3d" xmlns:o="urn:schemas-microsoft-com:office:office" xmlns:oel="http://schemas.microsoft.com/office/2019/extlst" xmlns:r="http://schemas.openxmlformats.org/officeDocument/2006/relationships" xmlns:m="http://schemas.openxmlformats.org/officeDocument/2006/math" xmlns:v="urn:schemas-microsoft-com:vml" xmlns:wp14="http://schemas.microsoft.com/office/word/2010/wordprocessingDrawing" xmlns:wp="http://schemas.openxmlformats.org/drawingml/2006/wordprocessingDrawing" xmlns:w10="urn:schemas-microsoft-com:office:word" xmlns:w="http://schemas.openxmlformats.org/wordprocessingml/2006/main" xmlns:w14="http://schemas.microsoft.com/office/word/2010/wordml" xmlns:w15="http://schemas.microsoft.com/office/word/2012/wordml" xmlns:w16cex="http://schemas.microsoft.com/office/word/2018/wordml/cex" xmlns:w16cid="http://schemas.microsoft.com/office/word/2016/wordml/cid" xmlns:w16="http://schemas.microsoft.com/office/word/2018/wordml" xmlns:w16du="http://schemas.microsoft.com/office/word/2023/wordml/word16du" xmlns:w16sdtdh="http://schemas.microsoft.com/office/word/2020/wordml/sdtdatahash" xmlns:w16sdtfl="http://schemas.microsoft.com/office/word/2024/wordml/sdtformatlock" xmlns:w16se="http://schemas.microsoft.com/office/word/2015/wordml/symex" xmlns:wpg="http://schemas.microsoft.com/office/word/2010/wordprocessingGroup" xmlns:wpi="http://schemas.microsoft.com/office/word/2010/wordprocessingInk" xmlns:wne="http://schemas.microsoft.com/office/word/2006/wordml" xmlns:wps="http://schemas.microsoft.com/office/word/2010/wordprocessingShape" mc:Ignorable="w14 w15 w16se w16cid w16 w16cex w16sdtdh w16sdtfl w16du wp14">
   <w:tbl>
     <w:tblPr>
       <w:tblpPr w:leftFromText="187" w:rightFromText="187" w:vertAnchor="page" w:horzAnchor="margin" w:tblpXSpec="center" w:tblpYSpec="bottom"/>
@@ -1940,14 +1871,14 @@
   </w:tbl>
   <w:p>
     <w:pPr>
-      <w:pStyle w:val="Piedepgina"/>
+      <w:pStyle w:val="Footer"/>
     </w:pPr>
   </w:p>
 </w:ftr>
 </file>
 
 <file path=word/footnotes.xml><?xml version="1.0" encoding="utf-8"?>
-<w:footnotes xmlns:wpc="http://schemas.microsoft.com/office/word/2010/wordprocessingCanvas" xmlns:cx="http://schemas.microsoft.com/office/drawing/2014/chartex" xmlns:mc="http://schemas.openxmlformats.org/markup-compatibility/2006" xmlns:o="urn:schemas-microsoft-com:office:office" xmlns:r="http://schemas.openxmlformats.org/officeDocument/2006/relationships" xmlns:m="http://schemas.openxmlformats.org/officeDocument/2006/math" xmlns:v="urn:schemas-microsoft-com:vml" xmlns:wp14="http://schemas.microsoft.com/office/word/2010/wordprocessingDrawing" xmlns:wp="http://schemas.openxmlformats.org/drawingml/2006/wordprocessingDrawing" xmlns:w10="urn:schemas-microsoft-com:office:word" xmlns:w="http://schemas.openxmlformats.org/wordprocessingml/2006/main" xmlns:w14="http://schemas.microsoft.com/office/word/2010/wordml" xmlns:w15="http://schemas.microsoft.com/office/word/2012/wordml" xmlns:w16se="http://schemas.microsoft.com/office/word/2015/wordml/symex" xmlns:wpg="http://schemas.microsoft.com/office/word/2010/wordprocessingGroup" xmlns:wpi="http://schemas.microsoft.com/office/word/2010/wordprocessingInk" xmlns:wne="http://schemas.microsoft.com/office/word/2006/wordml" xmlns:wps="http://schemas.microsoft.com/office/word/2010/wordprocessingShape" mc:Ignorable="w14 w15 w16se wp14">
+<w:footnotes xmlns:wpc="http://schemas.microsoft.com/office/word/2010/wordprocessingCanvas" xmlns:cx="http://schemas.microsoft.com/office/drawing/2014/chartex" xmlns:cx1="http://schemas.microsoft.com/office/drawing/2015/9/8/chartex" xmlns:cx2="http://schemas.microsoft.com/office/drawing/2015/10/21/chartex" xmlns:cx3="http://schemas.microsoft.com/office/drawing/2016/5/9/chartex" xmlns:cx4="http://schemas.microsoft.com/office/drawing/2016/5/10/chartex" xmlns:cx5="http://schemas.microsoft.com/office/drawing/2016/5/11/chartex" xmlns:cx6="http://schemas.microsoft.com/office/drawing/2016/5/12/chartex" xmlns:cx7="http://schemas.microsoft.com/office/drawing/2016/5/13/chartex" xmlns:cx8="http://schemas.microsoft.com/office/drawing/2016/5/14/chartex" xmlns:mc="http://schemas.openxmlformats.org/markup-compatibility/2006" xmlns:aink="http://schemas.microsoft.com/office/drawing/2016/ink" xmlns:am3d="http://schemas.microsoft.com/office/drawing/2017/model3d" xmlns:o="urn:schemas-microsoft-com:office:office" xmlns:oel="http://schemas.microsoft.com/office/2019/extlst" xmlns:r="http://schemas.openxmlformats.org/officeDocument/2006/relationships" xmlns:m="http://schemas.openxmlformats.org/officeDocument/2006/math" xmlns:v="urn:schemas-microsoft-com:vml" xmlns:wp14="http://schemas.microsoft.com/office/word/2010/wordprocessingDrawing" xmlns:wp="http://schemas.openxmlformats.org/drawingml/2006/wordprocessingDrawing" xmlns:w10="urn:schemas-microsoft-com:office:word" xmlns:w="http://schemas.openxmlformats.org/wordprocessingml/2006/main" xmlns:w14="http://schemas.microsoft.com/office/word/2010/wordml" xmlns:w15="http://schemas.microsoft.com/office/word/2012/wordml" xmlns:w16cex="http://schemas.microsoft.com/office/word/2018/wordml/cex" xmlns:w16cid="http://schemas.microsoft.com/office/word/2016/wordml/cid" xmlns:w16="http://schemas.microsoft.com/office/word/2018/wordml" xmlns:w16du="http://schemas.microsoft.com/office/word/2023/wordml/word16du" xmlns:w16sdtdh="http://schemas.microsoft.com/office/word/2020/wordml/sdtdatahash" xmlns:w16sdtfl="http://schemas.microsoft.com/office/word/2024/wordml/sdtformatlock" xmlns:w16se="http://schemas.microsoft.com/office/word/2015/wordml/symex" xmlns:wpg="http://schemas.microsoft.com/office/word/2010/wordprocessingGroup" xmlns:wpi="http://schemas.microsoft.com/office/word/2010/wordprocessingInk" xmlns:wne="http://schemas.microsoft.com/office/word/2006/wordml" xmlns:wps="http://schemas.microsoft.com/office/word/2010/wordprocessingShape" mc:Ignorable="w14 w15 w16se w16cid w16 w16cex w16sdtdh w16sdtfl w16du wp14">
   <w:footnote w:type="separator" w:id="-1">
     <w:p>
       <w:pPr>
@@ -1972,10 +1903,10 @@
 </file>
 
 <file path=word/header1.xml><?xml version="1.0" encoding="utf-8"?>
-<w:hdr xmlns:wpc="http://schemas.microsoft.com/office/word/2010/wordprocessingCanvas" xmlns:cx="http://schemas.microsoft.com/office/drawing/2014/chartex" xmlns:mc="http://schemas.openxmlformats.org/markup-compatibility/2006" xmlns:o="urn:schemas-microsoft-com:office:office" xmlns:r="http://schemas.openxmlformats.org/officeDocument/2006/relationships" xmlns:m="http://schemas.openxmlformats.org/officeDocument/2006/math" xmlns:v="urn:schemas-microsoft-com:vml" xmlns:wp14="http://schemas.microsoft.com/office/word/2010/wordprocessingDrawing" xmlns:wp="http://schemas.openxmlformats.org/drawingml/2006/wordprocessingDrawing" xmlns:w10="urn:schemas-microsoft-com:office:word" xmlns:w="http://schemas.openxmlformats.org/wordprocessingml/2006/main" xmlns:w14="http://schemas.microsoft.com/office/word/2010/wordml" xmlns:w15="http://schemas.microsoft.com/office/word/2012/wordml" xmlns:w16se="http://schemas.microsoft.com/office/word/2015/wordml/symex" xmlns:wpg="http://schemas.microsoft.com/office/word/2010/wordprocessingGroup" xmlns:wpi="http://schemas.microsoft.com/office/word/2010/wordprocessingInk" xmlns:wne="http://schemas.microsoft.com/office/word/2006/wordml" xmlns:wps="http://schemas.microsoft.com/office/word/2010/wordprocessingShape" mc:Ignorable="w14 w15 w16se wp14">
+<w:hdr xmlns:wpc="http://schemas.microsoft.com/office/word/2010/wordprocessingCanvas" xmlns:cx="http://schemas.microsoft.com/office/drawing/2014/chartex" xmlns:cx1="http://schemas.microsoft.com/office/drawing/2015/9/8/chartex" xmlns:cx2="http://schemas.microsoft.com/office/drawing/2015/10/21/chartex" xmlns:cx3="http://schemas.microsoft.com/office/drawing/2016/5/9/chartex" xmlns:cx4="http://schemas.microsoft.com/office/drawing/2016/5/10/chartex" xmlns:cx5="http://schemas.microsoft.com/office/drawing/2016/5/11/chartex" xmlns:cx6="http://schemas.microsoft.com/office/drawing/2016/5/12/chartex" xmlns:cx7="http://schemas.microsoft.com/office/drawing/2016/5/13/chartex" xmlns:cx8="http://schemas.microsoft.com/office/drawing/2016/5/14/chartex" xmlns:mc="http://schemas.openxmlformats.org/markup-compatibility/2006" xmlns:aink="http://schemas.microsoft.com/office/drawing/2016/ink" xmlns:am3d="http://schemas.microsoft.com/office/drawing/2017/model3d" xmlns:o="urn:schemas-microsoft-com:office:office" xmlns:oel="http://schemas.microsoft.com/office/2019/extlst" xmlns:r="http://schemas.openxmlformats.org/officeDocument/2006/relationships" xmlns:m="http://schemas.openxmlformats.org/officeDocument/2006/math" xmlns:v="urn:schemas-microsoft-com:vml" xmlns:wp14="http://schemas.microsoft.com/office/word/2010/wordprocessingDrawing" xmlns:wp="http://schemas.openxmlformats.org/drawingml/2006/wordprocessingDrawing" xmlns:w10="urn:schemas-microsoft-com:office:word" xmlns:w="http://schemas.openxmlformats.org/wordprocessingml/2006/main" xmlns:w14="http://schemas.microsoft.com/office/word/2010/wordml" xmlns:w15="http://schemas.microsoft.com/office/word/2012/wordml" xmlns:w16cex="http://schemas.microsoft.com/office/word/2018/wordml/cex" xmlns:w16cid="http://schemas.microsoft.com/office/word/2016/wordml/cid" xmlns:w16="http://schemas.microsoft.com/office/word/2018/wordml" xmlns:w16du="http://schemas.microsoft.com/office/word/2023/wordml/word16du" xmlns:w16sdtdh="http://schemas.microsoft.com/office/word/2020/wordml/sdtdatahash" xmlns:w16sdtfl="http://schemas.microsoft.com/office/word/2024/wordml/sdtformatlock" xmlns:w16se="http://schemas.microsoft.com/office/word/2015/wordml/symex" xmlns:wpg="http://schemas.microsoft.com/office/word/2010/wordprocessingGroup" xmlns:wpi="http://schemas.microsoft.com/office/word/2010/wordprocessingInk" xmlns:wne="http://schemas.microsoft.com/office/word/2006/wordml" xmlns:wps="http://schemas.microsoft.com/office/word/2010/wordprocessingShape" mc:Ignorable="w14 w15 w16se w16cid w16 w16cex w16sdtdh w16sdtfl w16du wp14">
   <w:p>
     <w:pPr>
-      <w:pStyle w:val="Encabezado"/>
+      <w:pStyle w:val="Header"/>
       <w:rPr>
         <w:b/>
         <w:color w:val="2E74B5" w:themeColor="accent1" w:themeShade="BF"/>
@@ -2082,8 +2013,120 @@
 </file>
 
 <file path=word/numbering.xml><?xml version="1.0" encoding="utf-8"?>
-<w:numbering xmlns:wpc="http://schemas.microsoft.com/office/word/2010/wordprocessingCanvas" xmlns:cx="http://schemas.microsoft.com/office/drawing/2014/chartex" xmlns:mc="http://schemas.openxmlformats.org/markup-compatibility/2006" xmlns:o="urn:schemas-microsoft-com:office:office" xmlns:r="http://schemas.openxmlformats.org/officeDocument/2006/relationships" xmlns:m="http://schemas.openxmlformats.org/officeDocument/2006/math" xmlns:v="urn:schemas-microsoft-com:vml" xmlns:wp14="http://schemas.microsoft.com/office/word/2010/wordprocessingDrawing" xmlns:wp="http://schemas.openxmlformats.org/drawingml/2006/wordprocessingDrawing" xmlns:w10="urn:schemas-microsoft-com:office:word" xmlns:w="http://schemas.openxmlformats.org/wordprocessingml/2006/main" xmlns:w14="http://schemas.microsoft.com/office/word/2010/wordml" xmlns:w15="http://schemas.microsoft.com/office/word/2012/wordml" xmlns:w16se="http://schemas.microsoft.com/office/word/2015/wordml/symex" xmlns:wpg="http://schemas.microsoft.com/office/word/2010/wordprocessingGroup" xmlns:wpi="http://schemas.microsoft.com/office/word/2010/wordprocessingInk" xmlns:wne="http://schemas.microsoft.com/office/word/2006/wordml" xmlns:wps="http://schemas.microsoft.com/office/word/2010/wordprocessingShape" mc:Ignorable="w14 w15 w16se wp14">
+<w:numbering xmlns:wpc="http://schemas.microsoft.com/office/word/2010/wordprocessingCanvas" xmlns:cx="http://schemas.microsoft.com/office/drawing/2014/chartex" xmlns:cx1="http://schemas.microsoft.com/office/drawing/2015/9/8/chartex" xmlns:cx2="http://schemas.microsoft.com/office/drawing/2015/10/21/chartex" xmlns:cx3="http://schemas.microsoft.com/office/drawing/2016/5/9/chartex" xmlns:cx4="http://schemas.microsoft.com/office/drawing/2016/5/10/chartex" xmlns:cx5="http://schemas.microsoft.com/office/drawing/2016/5/11/chartex" xmlns:cx6="http://schemas.microsoft.com/office/drawing/2016/5/12/chartex" xmlns:cx7="http://schemas.microsoft.com/office/drawing/2016/5/13/chartex" xmlns:cx8="http://schemas.microsoft.com/office/drawing/2016/5/14/chartex" xmlns:mc="http://schemas.openxmlformats.org/markup-compatibility/2006" xmlns:aink="http://schemas.microsoft.com/office/drawing/2016/ink" xmlns:am3d="http://schemas.microsoft.com/office/drawing/2017/model3d" xmlns:o="urn:schemas-microsoft-com:office:office" xmlns:oel="http://schemas.microsoft.com/office/2019/extlst" xmlns:r="http://schemas.openxmlformats.org/officeDocument/2006/relationships" xmlns:m="http://schemas.openxmlformats.org/officeDocument/2006/math" xmlns:v="urn:schemas-microsoft-com:vml" xmlns:wp14="http://schemas.microsoft.com/office/word/2010/wordprocessingDrawing" xmlns:wp="http://schemas.openxmlformats.org/drawingml/2006/wordprocessingDrawing" xmlns:w10="urn:schemas-microsoft-com:office:word" xmlns:w="http://schemas.openxmlformats.org/wordprocessingml/2006/main" xmlns:w14="http://schemas.microsoft.com/office/word/2010/wordml" xmlns:w15="http://schemas.microsoft.com/office/word/2012/wordml" xmlns:w16cex="http://schemas.microsoft.com/office/word/2018/wordml/cex" xmlns:w16cid="http://schemas.microsoft.com/office/word/2016/wordml/cid" xmlns:w16="http://schemas.microsoft.com/office/word/2018/wordml" xmlns:w16du="http://schemas.microsoft.com/office/word/2023/wordml/word16du" xmlns:w16sdtdh="http://schemas.microsoft.com/office/word/2020/wordml/sdtdatahash" xmlns:w16sdtfl="http://schemas.microsoft.com/office/word/2024/wordml/sdtformatlock" xmlns:w16se="http://schemas.microsoft.com/office/word/2015/wordml/symex" xmlns:wpg="http://schemas.microsoft.com/office/word/2010/wordprocessingGroup" xmlns:wpi="http://schemas.microsoft.com/office/word/2010/wordprocessingInk" xmlns:wne="http://schemas.microsoft.com/office/word/2006/wordml" xmlns:wps="http://schemas.microsoft.com/office/word/2010/wordprocessingShape" mc:Ignorable="w14 w15 w16se w16cid w16 w16cex w16sdtdh w16sdtfl w16du wp14">
   <w:abstractNum w:abstractNumId="0" w15:restartNumberingAfterBreak="0">
+    <w:nsid w:val="06337AE2"/>
+    <w:multiLevelType w:val="hybridMultilevel"/>
+    <w:tmpl w:val="51B8921C"/>
+    <w:lvl w:ilvl="0" w:tplc="E83CD614">
+      <w:numFmt w:val="bullet"/>
+      <w:lvlText w:val="-"/>
+      <w:lvlJc w:val="left"/>
+      <w:pPr>
+        <w:ind w:left="720" w:hanging="360"/>
+      </w:pPr>
+      <w:rPr>
+        <w:rFonts w:ascii="Calibri" w:eastAsiaTheme="minorHAnsi" w:hAnsi="Calibri" w:cs="Calibri" w:hint="default"/>
+      </w:rPr>
+    </w:lvl>
+    <w:lvl w:ilvl="1" w:tplc="08090003" w:tentative="1">
+      <w:start w:val="1"/>
+      <w:numFmt w:val="bullet"/>
+      <w:lvlText w:val="o"/>
+      <w:lvlJc w:val="left"/>
+      <w:pPr>
+        <w:ind w:left="1440" w:hanging="360"/>
+      </w:pPr>
+      <w:rPr>
+        <w:rFonts w:ascii="Courier New" w:hAnsi="Courier New" w:cs="Courier New" w:hint="default"/>
+      </w:rPr>
+    </w:lvl>
+    <w:lvl w:ilvl="2" w:tplc="08090005" w:tentative="1">
+      <w:start w:val="1"/>
+      <w:numFmt w:val="bullet"/>
+      <w:lvlText w:val=""/>
+      <w:lvlJc w:val="left"/>
+      <w:pPr>
+        <w:ind w:left="2160" w:hanging="360"/>
+      </w:pPr>
+      <w:rPr>
+        <w:rFonts w:ascii="Wingdings" w:hAnsi="Wingdings" w:hint="default"/>
+      </w:rPr>
+    </w:lvl>
+    <w:lvl w:ilvl="3" w:tplc="08090001" w:tentative="1">
+      <w:start w:val="1"/>
+      <w:numFmt w:val="bullet"/>
+      <w:lvlText w:val=""/>
+      <w:lvlJc w:val="left"/>
+      <w:pPr>
+        <w:ind w:left="2880" w:hanging="360"/>
+      </w:pPr>
+      <w:rPr>
+        <w:rFonts w:ascii="Symbol" w:hAnsi="Symbol" w:hint="default"/>
+      </w:rPr>
+    </w:lvl>
+    <w:lvl w:ilvl="4" w:tplc="08090003" w:tentative="1">
+      <w:start w:val="1"/>
+      <w:numFmt w:val="bullet"/>
+      <w:lvlText w:val="o"/>
+      <w:lvlJc w:val="left"/>
+      <w:pPr>
+        <w:ind w:left="3600" w:hanging="360"/>
+      </w:pPr>
+      <w:rPr>
+        <w:rFonts w:ascii="Courier New" w:hAnsi="Courier New" w:cs="Courier New" w:hint="default"/>
+      </w:rPr>
+    </w:lvl>
+    <w:lvl w:ilvl="5" w:tplc="08090005" w:tentative="1">
+      <w:start w:val="1"/>
+      <w:numFmt w:val="bullet"/>
+      <w:lvlText w:val=""/>
+      <w:lvlJc w:val="left"/>
+      <w:pPr>
+        <w:ind w:left="4320" w:hanging="360"/>
+      </w:pPr>
+      <w:rPr>
+        <w:rFonts w:ascii="Wingdings" w:hAnsi="Wingdings" w:hint="default"/>
+      </w:rPr>
+    </w:lvl>
+    <w:lvl w:ilvl="6" w:tplc="08090001" w:tentative="1">
+      <w:start w:val="1"/>
+      <w:numFmt w:val="bullet"/>
+      <w:lvlText w:val=""/>
+      <w:lvlJc w:val="left"/>
+      <w:pPr>
+        <w:ind w:left="5040" w:hanging="360"/>
+      </w:pPr>
+      <w:rPr>
+        <w:rFonts w:ascii="Symbol" w:hAnsi="Symbol" w:hint="default"/>
+      </w:rPr>
+    </w:lvl>
+    <w:lvl w:ilvl="7" w:tplc="08090003" w:tentative="1">
+      <w:start w:val="1"/>
+      <w:numFmt w:val="bullet"/>
+      <w:lvlText w:val="o"/>
+      <w:lvlJc w:val="left"/>
+      <w:pPr>
+        <w:ind w:left="5760" w:hanging="360"/>
+      </w:pPr>
+      <w:rPr>
+        <w:rFonts w:ascii="Courier New" w:hAnsi="Courier New" w:cs="Courier New" w:hint="default"/>
+      </w:rPr>
+    </w:lvl>
+    <w:lvl w:ilvl="8" w:tplc="08090005" w:tentative="1">
+      <w:start w:val="1"/>
+      <w:numFmt w:val="bullet"/>
+      <w:lvlText w:val=""/>
+      <w:lvlJc w:val="left"/>
+      <w:pPr>
+        <w:ind w:left="6480" w:hanging="360"/>
+      </w:pPr>
+      <w:rPr>
+        <w:rFonts w:ascii="Wingdings" w:hAnsi="Wingdings" w:hint="default"/>
+      </w:rPr>
+    </w:lvl>
+  </w:abstractNum>
+  <w:abstractNum w:abstractNumId="1" w15:restartNumberingAfterBreak="0">
     <w:nsid w:val="07F57FF2"/>
     <w:multiLevelType w:val="hybridMultilevel"/>
     <w:tmpl w:val="1986AC92"/>
@@ -2195,7 +2238,7 @@
       </w:rPr>
     </w:lvl>
   </w:abstractNum>
-  <w:abstractNum w:abstractNumId="1" w15:restartNumberingAfterBreak="0">
+  <w:abstractNum w:abstractNumId="2" w15:restartNumberingAfterBreak="0">
     <w:nsid w:val="1C5E00F4"/>
     <w:multiLevelType w:val="hybridMultilevel"/>
     <w:tmpl w:val="046019F2"/>
@@ -2284,7 +2327,7 @@
       </w:pPr>
     </w:lvl>
   </w:abstractNum>
-  <w:abstractNum w:abstractNumId="2" w15:restartNumberingAfterBreak="0">
+  <w:abstractNum w:abstractNumId="3" w15:restartNumberingAfterBreak="0">
     <w:nsid w:val="1D5E5CDF"/>
     <w:multiLevelType w:val="hybridMultilevel"/>
     <w:tmpl w:val="8E561E8A"/>
@@ -2397,7 +2440,7 @@
       </w:rPr>
     </w:lvl>
   </w:abstractNum>
-  <w:abstractNum w:abstractNumId="3" w15:restartNumberingAfterBreak="0">
+  <w:abstractNum w:abstractNumId="4" w15:restartNumberingAfterBreak="0">
     <w:nsid w:val="77B810FE"/>
     <w:multiLevelType w:val="hybridMultilevel"/>
     <w:tmpl w:val="07189D66"/>
@@ -2510,23 +2553,26 @@
       </w:rPr>
     </w:lvl>
   </w:abstractNum>
-  <w:num w:numId="1">
+  <w:num w:numId="1" w16cid:durableId="795104441">
+    <w:abstractNumId w:val="2"/>
+  </w:num>
+  <w:num w:numId="2" w16cid:durableId="2095081204">
+    <w:abstractNumId w:val="4"/>
+  </w:num>
+  <w:num w:numId="3" w16cid:durableId="844325095">
+    <w:abstractNumId w:val="3"/>
+  </w:num>
+  <w:num w:numId="4" w16cid:durableId="1998075747">
     <w:abstractNumId w:val="1"/>
   </w:num>
-  <w:num w:numId="2">
-    <w:abstractNumId w:val="3"/>
-  </w:num>
-  <w:num w:numId="3">
-    <w:abstractNumId w:val="2"/>
-  </w:num>
-  <w:num w:numId="4">
+  <w:num w:numId="5" w16cid:durableId="872886391">
     <w:abstractNumId w:val="0"/>
   </w:num>
 </w:numbering>
 </file>
 
 <file path=word/styles.xml><?xml version="1.0" encoding="utf-8"?>
-<w:styles xmlns:mc="http://schemas.openxmlformats.org/markup-compatibility/2006" xmlns:r="http://schemas.openxmlformats.org/officeDocument/2006/relationships" xmlns:w="http://schemas.openxmlformats.org/wordprocessingml/2006/main" xmlns:w14="http://schemas.microsoft.com/office/word/2010/wordml" xmlns:w15="http://schemas.microsoft.com/office/word/2012/wordml" xmlns:w16se="http://schemas.microsoft.com/office/word/2015/wordml/symex" mc:Ignorable="w14 w15 w16se">
+<w:styles xmlns:mc="http://schemas.openxmlformats.org/markup-compatibility/2006" xmlns:r="http://schemas.openxmlformats.org/officeDocument/2006/relationships" xmlns:w="http://schemas.openxmlformats.org/wordprocessingml/2006/main" xmlns:w14="http://schemas.microsoft.com/office/word/2010/wordml" xmlns:w15="http://schemas.microsoft.com/office/word/2012/wordml" xmlns:w16cex="http://schemas.microsoft.com/office/word/2018/wordml/cex" xmlns:w16cid="http://schemas.microsoft.com/office/word/2016/wordml/cid" xmlns:w16="http://schemas.microsoft.com/office/word/2018/wordml" xmlns:w16du="http://schemas.microsoft.com/office/word/2023/wordml/word16du" xmlns:w16sdtdh="http://schemas.microsoft.com/office/word/2020/wordml/sdtdatahash" xmlns:w16sdtfl="http://schemas.microsoft.com/office/word/2024/wordml/sdtformatlock" xmlns:w16se="http://schemas.microsoft.com/office/word/2015/wordml/symex" mc:Ignorable="w14 w15 w16se w16cid w16 w16cex w16sdtdh w16sdtfl w16du">
   <w:docDefaults>
     <w:rPrDefault>
       <w:rPr>
@@ -2543,7 +2589,7 @@
       </w:pPr>
     </w:pPrDefault>
   </w:docDefaults>
-  <w:latentStyles w:defLockedState="0" w:defUIPriority="99" w:defSemiHidden="0" w:defUnhideWhenUsed="0" w:defQFormat="0" w:count="371">
+  <w:latentStyles w:defLockedState="0" w:defUIPriority="99" w:defSemiHidden="0" w:defUnhideWhenUsed="0" w:defQFormat="0" w:count="376">
     <w:lsdException w:name="Normal" w:uiPriority="0" w:qFormat="1"/>
     <w:lsdException w:name="heading 1" w:uiPriority="9" w:qFormat="1"/>
     <w:lsdException w:name="heading 2" w:semiHidden="1" w:uiPriority="9" w:unhideWhenUsed="1" w:qFormat="1"/>
@@ -2915,16 +2961,21 @@
     <w:lsdException w:name="List Table 5 Dark Accent 6" w:uiPriority="50"/>
     <w:lsdException w:name="List Table 6 Colorful Accent 6" w:uiPriority="51"/>
     <w:lsdException w:name="List Table 7 Colorful Accent 6" w:uiPriority="52"/>
+    <w:lsdException w:name="Mention" w:semiHidden="1" w:unhideWhenUsed="1"/>
+    <w:lsdException w:name="Smart Hyperlink" w:semiHidden="1" w:unhideWhenUsed="1"/>
+    <w:lsdException w:name="Hashtag" w:semiHidden="1" w:unhideWhenUsed="1"/>
+    <w:lsdException w:name="Unresolved Mention" w:semiHidden="1" w:unhideWhenUsed="1"/>
+    <w:lsdException w:name="Smart Link" w:semiHidden="1" w:unhideWhenUsed="1"/>
   </w:latentStyles>
   <w:style w:type="paragraph" w:default="1" w:styleId="Normal">
     <w:name w:val="Normal"/>
     <w:qFormat/>
   </w:style>
-  <w:style w:type="paragraph" w:styleId="Ttulo1">
+  <w:style w:type="paragraph" w:styleId="Heading1">
     <w:name w:val="heading 1"/>
     <w:basedOn w:val="Normal"/>
     <w:next w:val="Normal"/>
-    <w:link w:val="Ttulo1Car"/>
+    <w:link w:val="Heading1Char"/>
     <w:uiPriority w:val="9"/>
     <w:qFormat/>
     <w:rsid w:val="006F2BD8"/>
@@ -2942,11 +2993,11 @@
       <w:szCs w:val="32"/>
     </w:rPr>
   </w:style>
-  <w:style w:type="paragraph" w:styleId="Ttulo2">
+  <w:style w:type="paragraph" w:styleId="Heading2">
     <w:name w:val="heading 2"/>
     <w:basedOn w:val="Normal"/>
     <w:next w:val="Normal"/>
-    <w:link w:val="Ttulo2Car"/>
+    <w:link w:val="Heading2Char"/>
     <w:uiPriority w:val="9"/>
     <w:unhideWhenUsed/>
     <w:qFormat/>
@@ -2964,13 +3015,13 @@
       <w:szCs w:val="26"/>
     </w:rPr>
   </w:style>
-  <w:style w:type="character" w:default="1" w:styleId="Fuentedeprrafopredeter">
+  <w:style w:type="character" w:default="1" w:styleId="DefaultParagraphFont">
     <w:name w:val="Default Paragraph Font"/>
     <w:uiPriority w:val="1"/>
     <w:semiHidden/>
     <w:unhideWhenUsed/>
   </w:style>
-  <w:style w:type="table" w:default="1" w:styleId="Tablanormal">
+  <w:style w:type="table" w:default="1" w:styleId="TableNormal">
     <w:name w:val="Normal Table"/>
     <w:uiPriority w:val="99"/>
     <w:semiHidden/>
@@ -2985,15 +3036,15 @@
       </w:tblCellMar>
     </w:tblPr>
   </w:style>
-  <w:style w:type="numbering" w:default="1" w:styleId="Sinlista">
+  <w:style w:type="numbering" w:default="1" w:styleId="NoList">
     <w:name w:val="No List"/>
     <w:uiPriority w:val="99"/>
     <w:semiHidden/>
     <w:unhideWhenUsed/>
   </w:style>
-  <w:style w:type="paragraph" w:styleId="Sinespaciado">
+  <w:style w:type="paragraph" w:styleId="NoSpacing">
     <w:name w:val="No Spacing"/>
-    <w:link w:val="SinespaciadoCar"/>
+    <w:link w:val="NoSpacingChar"/>
     <w:uiPriority w:val="1"/>
     <w:qFormat/>
     <w:rsid w:val="006F2BD8"/>
@@ -3006,10 +3057,10 @@
       <w:lang w:eastAsia="es-ES"/>
     </w:rPr>
   </w:style>
-  <w:style w:type="character" w:customStyle="1" w:styleId="SinespaciadoCar">
-    <w:name w:val="Sin espaciado Car"/>
-    <w:basedOn w:val="Fuentedeprrafopredeter"/>
-    <w:link w:val="Sinespaciado"/>
+  <w:style w:type="character" w:customStyle="1" w:styleId="NoSpacingChar">
+    <w:name w:val="No Spacing Char"/>
+    <w:basedOn w:val="DefaultParagraphFont"/>
+    <w:link w:val="NoSpacing"/>
     <w:uiPriority w:val="1"/>
     <w:rsid w:val="006F2BD8"/>
     <w:rPr>
@@ -3017,9 +3068,9 @@
       <w:lang w:eastAsia="es-ES"/>
     </w:rPr>
   </w:style>
-  <w:style w:type="character" w:styleId="Textodelmarcadordeposicin">
+  <w:style w:type="character" w:styleId="PlaceholderText">
     <w:name w:val="Placeholder Text"/>
-    <w:basedOn w:val="Fuentedeprrafopredeter"/>
+    <w:basedOn w:val="DefaultParagraphFont"/>
     <w:uiPriority w:val="99"/>
     <w:semiHidden/>
     <w:rsid w:val="006F2BD8"/>
@@ -3027,10 +3078,10 @@
       <w:color w:val="808080"/>
     </w:rPr>
   </w:style>
-  <w:style w:type="paragraph" w:styleId="Encabezado">
+  <w:style w:type="paragraph" w:styleId="Header">
     <w:name w:val="header"/>
     <w:basedOn w:val="Normal"/>
-    <w:link w:val="EncabezadoCar"/>
+    <w:link w:val="HeaderChar"/>
     <w:uiPriority w:val="99"/>
     <w:unhideWhenUsed/>
     <w:rsid w:val="006F2BD8"/>
@@ -3042,17 +3093,17 @@
       <w:spacing w:before="0" w:after="0" w:line="240" w:lineRule="auto"/>
     </w:pPr>
   </w:style>
-  <w:style w:type="character" w:customStyle="1" w:styleId="EncabezadoCar">
-    <w:name w:val="Encabezado Car"/>
-    <w:basedOn w:val="Fuentedeprrafopredeter"/>
-    <w:link w:val="Encabezado"/>
+  <w:style w:type="character" w:customStyle="1" w:styleId="HeaderChar">
+    <w:name w:val="Header Char"/>
+    <w:basedOn w:val="DefaultParagraphFont"/>
+    <w:link w:val="Header"/>
     <w:uiPriority w:val="99"/>
     <w:rsid w:val="006F2BD8"/>
   </w:style>
-  <w:style w:type="paragraph" w:styleId="Piedepgina">
+  <w:style w:type="paragraph" w:styleId="Footer">
     <w:name w:val="footer"/>
     <w:basedOn w:val="Normal"/>
-    <w:link w:val="PiedepginaCar"/>
+    <w:link w:val="FooterChar"/>
     <w:uiPriority w:val="99"/>
     <w:unhideWhenUsed/>
     <w:rsid w:val="006F2BD8"/>
@@ -3064,17 +3115,17 @@
       <w:spacing w:before="0" w:after="0" w:line="240" w:lineRule="auto"/>
     </w:pPr>
   </w:style>
-  <w:style w:type="character" w:customStyle="1" w:styleId="PiedepginaCar">
-    <w:name w:val="Pie de página Car"/>
-    <w:basedOn w:val="Fuentedeprrafopredeter"/>
-    <w:link w:val="Piedepgina"/>
+  <w:style w:type="character" w:customStyle="1" w:styleId="FooterChar">
+    <w:name w:val="Footer Char"/>
+    <w:basedOn w:val="DefaultParagraphFont"/>
+    <w:link w:val="Footer"/>
     <w:uiPriority w:val="99"/>
     <w:rsid w:val="006F2BD8"/>
   </w:style>
-  <w:style w:type="character" w:customStyle="1" w:styleId="Ttulo1Car">
-    <w:name w:val="Título 1 Car"/>
-    <w:basedOn w:val="Fuentedeprrafopredeter"/>
-    <w:link w:val="Ttulo1"/>
+  <w:style w:type="character" w:customStyle="1" w:styleId="Heading1Char">
+    <w:name w:val="Heading 1 Char"/>
+    <w:basedOn w:val="DefaultParagraphFont"/>
+    <w:link w:val="Heading1"/>
     <w:uiPriority w:val="9"/>
     <w:rsid w:val="006F2BD8"/>
     <w:rPr>
@@ -3085,25 +3136,25 @@
       <w:szCs w:val="32"/>
     </w:rPr>
   </w:style>
-  <w:style w:type="paragraph" w:styleId="Textoindependiente">
+  <w:style w:type="paragraph" w:styleId="BodyText">
     <w:name w:val="Body Text"/>
     <w:basedOn w:val="Normal"/>
-    <w:link w:val="TextoindependienteCar"/>
+    <w:link w:val="BodyTextChar"/>
     <w:uiPriority w:val="99"/>
     <w:unhideWhenUsed/>
     <w:rsid w:val="006F2BD8"/>
   </w:style>
-  <w:style w:type="character" w:customStyle="1" w:styleId="TextoindependienteCar">
-    <w:name w:val="Texto independiente Car"/>
-    <w:basedOn w:val="Fuentedeprrafopredeter"/>
-    <w:link w:val="Textoindependiente"/>
+  <w:style w:type="character" w:customStyle="1" w:styleId="BodyTextChar">
+    <w:name w:val="Body Text Char"/>
+    <w:basedOn w:val="DefaultParagraphFont"/>
+    <w:link w:val="BodyText"/>
     <w:uiPriority w:val="99"/>
     <w:rsid w:val="006F2BD8"/>
   </w:style>
-  <w:style w:type="character" w:customStyle="1" w:styleId="Ttulo2Car">
-    <w:name w:val="Título 2 Car"/>
-    <w:basedOn w:val="Fuentedeprrafopredeter"/>
-    <w:link w:val="Ttulo2"/>
+  <w:style w:type="character" w:customStyle="1" w:styleId="Heading2Char">
+    <w:name w:val="Heading 2 Char"/>
+    <w:basedOn w:val="DefaultParagraphFont"/>
+    <w:link w:val="Heading2"/>
     <w:uiPriority w:val="9"/>
     <w:rsid w:val="001C2E5F"/>
     <w:rPr>
@@ -3113,7 +3164,7 @@
       <w:szCs w:val="26"/>
     </w:rPr>
   </w:style>
-  <w:style w:type="paragraph" w:styleId="Prrafodelista">
+  <w:style w:type="paragraph" w:styleId="ListParagraph">
     <w:name w:val="List Paragraph"/>
     <w:basedOn w:val="Normal"/>
     <w:uiPriority w:val="34"/>
@@ -3124,9 +3175,9 @@
       <w:contextualSpacing/>
     </w:pPr>
   </w:style>
-  <w:style w:type="character" w:styleId="Hipervnculo">
+  <w:style w:type="character" w:styleId="Hyperlink">
     <w:name w:val="Hyperlink"/>
-    <w:basedOn w:val="Fuentedeprrafopredeter"/>
+    <w:basedOn w:val="DefaultParagraphFont"/>
     <w:uiPriority w:val="99"/>
     <w:unhideWhenUsed/>
     <w:rsid w:val="001C2E5F"/>
@@ -3135,9 +3186,9 @@
       <w:u w:val="single"/>
     </w:rPr>
   </w:style>
-  <w:style w:type="character" w:styleId="Hipervnculovisitado">
+  <w:style w:type="character" w:styleId="FollowedHyperlink">
     <w:name w:val="FollowedHyperlink"/>
-    <w:basedOn w:val="Fuentedeprrafopredeter"/>
+    <w:basedOn w:val="DefaultParagraphFont"/>
     <w:uiPriority w:val="99"/>
     <w:semiHidden/>
     <w:unhideWhenUsed/>
@@ -3147,9 +3198,9 @@
       <w:u w:val="single"/>
     </w:rPr>
   </w:style>
-  <w:style w:type="paragraph" w:styleId="TtuloTDC">
+  <w:style w:type="paragraph" w:styleId="TOCHeading">
     <w:name w:val="TOC Heading"/>
-    <w:basedOn w:val="Ttulo1"/>
+    <w:basedOn w:val="Heading1"/>
     <w:next w:val="Normal"/>
     <w:uiPriority w:val="39"/>
     <w:unhideWhenUsed/>
@@ -3166,7 +3217,7 @@
       <w:lang w:eastAsia="es-ES"/>
     </w:rPr>
   </w:style>
-  <w:style w:type="paragraph" w:styleId="TDC1">
+  <w:style w:type="paragraph" w:styleId="TOC1">
     <w:name w:val="toc 1"/>
     <w:basedOn w:val="Normal"/>
     <w:next w:val="Normal"/>
@@ -3178,7 +3229,7 @@
       <w:spacing w:after="100"/>
     </w:pPr>
   </w:style>
-  <w:style w:type="paragraph" w:styleId="TDC2">
+  <w:style w:type="paragraph" w:styleId="TOC2">
     <w:name w:val="toc 2"/>
     <w:basedOn w:val="Normal"/>
     <w:next w:val="Normal"/>
@@ -3191,11 +3242,23 @@
       <w:ind w:left="220"/>
     </w:pPr>
   </w:style>
+  <w:style w:type="character" w:styleId="UnresolvedMention">
+    <w:name w:val="Unresolved Mention"/>
+    <w:basedOn w:val="DefaultParagraphFont"/>
+    <w:uiPriority w:val="99"/>
+    <w:semiHidden/>
+    <w:unhideWhenUsed/>
+    <w:rsid w:val="00154A50"/>
+    <w:rPr>
+      <w:color w:val="605E5C"/>
+      <w:shd w:val="clear" w:color="auto" w:fill="E1DFDD"/>
+    </w:rPr>
+  </w:style>
 </w:styles>
 </file>
 
 <file path=word/glossary/document.xml><?xml version="1.0" encoding="utf-8"?>
-<w:glossaryDocument xmlns:wpc="http://schemas.microsoft.com/office/word/2010/wordprocessingCanvas" xmlns:cx="http://schemas.microsoft.com/office/drawing/2014/chartex" xmlns:mc="http://schemas.openxmlformats.org/markup-compatibility/2006" xmlns:o="urn:schemas-microsoft-com:office:office" xmlns:r="http://schemas.openxmlformats.org/officeDocument/2006/relationships" xmlns:m="http://schemas.openxmlformats.org/officeDocument/2006/math" xmlns:v="urn:schemas-microsoft-com:vml" xmlns:wp14="http://schemas.microsoft.com/office/word/2010/wordprocessingDrawing" xmlns:wp="http://schemas.openxmlformats.org/drawingml/2006/wordprocessingDrawing" xmlns:w10="urn:schemas-microsoft-com:office:word" xmlns:w="http://schemas.openxmlformats.org/wordprocessingml/2006/main" xmlns:w14="http://schemas.microsoft.com/office/word/2010/wordml" xmlns:w15="http://schemas.microsoft.com/office/word/2012/wordml" xmlns:w16se="http://schemas.microsoft.com/office/word/2015/wordml/symex" xmlns:wpg="http://schemas.microsoft.com/office/word/2010/wordprocessingGroup" xmlns:wpi="http://schemas.microsoft.com/office/word/2010/wordprocessingInk" xmlns:wne="http://schemas.microsoft.com/office/word/2006/wordml" xmlns:wps="http://schemas.microsoft.com/office/word/2010/wordprocessingShape" mc:Ignorable="w14 w15 w16se wp14">
+<w:glossaryDocument xmlns:wpc="http://schemas.microsoft.com/office/word/2010/wordprocessingCanvas" xmlns:cx="http://schemas.microsoft.com/office/drawing/2014/chartex" xmlns:cx1="http://schemas.microsoft.com/office/drawing/2015/9/8/chartex" xmlns:cx2="http://schemas.microsoft.com/office/drawing/2015/10/21/chartex" xmlns:cx3="http://schemas.microsoft.com/office/drawing/2016/5/9/chartex" xmlns:cx4="http://schemas.microsoft.com/office/drawing/2016/5/10/chartex" xmlns:cx5="http://schemas.microsoft.com/office/drawing/2016/5/11/chartex" xmlns:cx6="http://schemas.microsoft.com/office/drawing/2016/5/12/chartex" xmlns:cx7="http://schemas.microsoft.com/office/drawing/2016/5/13/chartex" xmlns:cx8="http://schemas.microsoft.com/office/drawing/2016/5/14/chartex" xmlns:mc="http://schemas.openxmlformats.org/markup-compatibility/2006" xmlns:aink="http://schemas.microsoft.com/office/drawing/2016/ink" xmlns:am3d="http://schemas.microsoft.com/office/drawing/2017/model3d" xmlns:o="urn:schemas-microsoft-com:office:office" xmlns:oel="http://schemas.microsoft.com/office/2019/extlst" xmlns:r="http://schemas.openxmlformats.org/officeDocument/2006/relationships" xmlns:m="http://schemas.openxmlformats.org/officeDocument/2006/math" xmlns:v="urn:schemas-microsoft-com:vml" xmlns:wp14="http://schemas.microsoft.com/office/word/2010/wordprocessingDrawing" xmlns:wp="http://schemas.openxmlformats.org/drawingml/2006/wordprocessingDrawing" xmlns:w10="urn:schemas-microsoft-com:office:word" xmlns:w="http://schemas.openxmlformats.org/wordprocessingml/2006/main" xmlns:w14="http://schemas.microsoft.com/office/word/2010/wordml" xmlns:w15="http://schemas.microsoft.com/office/word/2012/wordml" xmlns:w16cex="http://schemas.microsoft.com/office/word/2018/wordml/cex" xmlns:w16cid="http://schemas.microsoft.com/office/word/2016/wordml/cid" xmlns:w16="http://schemas.microsoft.com/office/word/2018/wordml" xmlns:w16du="http://schemas.microsoft.com/office/word/2023/wordml/word16du" xmlns:w16sdtdh="http://schemas.microsoft.com/office/word/2020/wordml/sdtdatahash" xmlns:w16sdtfl="http://schemas.microsoft.com/office/word/2024/wordml/sdtformatlock" xmlns:w16se="http://schemas.microsoft.com/office/word/2015/wordml/symex" xmlns:wpg="http://schemas.microsoft.com/office/word/2010/wordprocessingGroup" xmlns:wpi="http://schemas.microsoft.com/office/word/2010/wordprocessingInk" xmlns:wne="http://schemas.microsoft.com/office/word/2006/wordml" xmlns:wps="http://schemas.microsoft.com/office/word/2010/wordprocessingShape" mc:Ignorable="w14 w15 w16se w16cid w16 w16cex w16sdtdh w16sdtfl w16du wp14">
   <w:docParts>
     <w:docPart>
       <w:docPartPr>
@@ -3221,7 +3284,7 @@
             <w:rPr>
               <w:rFonts w:asciiTheme="majorHAnsi" w:eastAsiaTheme="majorEastAsia" w:hAnsiTheme="majorHAnsi" w:cstheme="majorBidi"/>
               <w:caps/>
-              <w:color w:val="5B9BD5" w:themeColor="accent1"/>
+              <w:color w:val="156082" w:themeColor="accent1"/>
               <w:sz w:val="80"/>
               <w:szCs w:val="80"/>
             </w:rPr>
@@ -3252,7 +3315,7 @@
           </w:pPr>
           <w:r>
             <w:rPr>
-              <w:color w:val="5B9BD5" w:themeColor="accent1"/>
+              <w:color w:val="156082" w:themeColor="accent1"/>
               <w:sz w:val="28"/>
               <w:szCs w:val="28"/>
             </w:rPr>
@@ -3280,7 +3343,7 @@
         <w:p>
           <w:r>
             <w:rPr>
-              <w:rStyle w:val="Textodelmarcadordeposicin"/>
+              <w:rStyle w:val="PlaceholderText"/>
             </w:rPr>
             <w:t>[Autor]</w:t>
           </w:r>
@@ -3306,7 +3369,7 @@
         <w:p>
           <w:r>
             <w:rPr>
-              <w:rStyle w:val="Textodelmarcadordeposicin"/>
+              <w:rStyle w:val="PlaceholderText"/>
             </w:rPr>
             <w:t>[Compañía]</w:t>
           </w:r>
@@ -3332,7 +3395,7 @@
         <w:p>
           <w:r>
             <w:rPr>
-              <w:rStyle w:val="Textodelmarcadordeposicin"/>
+              <w:rStyle w:val="PlaceholderText"/>
             </w:rPr>
             <w:t>[Autor]</w:t>
           </w:r>
@@ -3358,7 +3421,7 @@
         <w:p>
           <w:r>
             <w:rPr>
-              <w:rStyle w:val="Textodelmarcadordeposicin"/>
+              <w:rStyle w:val="PlaceholderText"/>
             </w:rPr>
             <w:t>[Compañía]</w:t>
           </w:r>
@@ -3384,7 +3447,7 @@
         <w:p>
           <w:r>
             <w:rPr>
-              <w:rStyle w:val="Textodelmarcadordeposicin"/>
+              <w:rStyle w:val="PlaceholderText"/>
             </w:rPr>
             <w:t>[Comentarios]</w:t>
           </w:r>
@@ -3396,13 +3459,13 @@
 </file>
 
 <file path=word/glossary/fontTable.xml><?xml version="1.0" encoding="utf-8"?>
-<w:fonts xmlns:mc="http://schemas.openxmlformats.org/markup-compatibility/2006" xmlns:r="http://schemas.openxmlformats.org/officeDocument/2006/relationships" xmlns:w="http://schemas.openxmlformats.org/wordprocessingml/2006/main" xmlns:w14="http://schemas.microsoft.com/office/word/2010/wordml" xmlns:w15="http://schemas.microsoft.com/office/word/2012/wordml" xmlns:w16se="http://schemas.microsoft.com/office/word/2015/wordml/symex" mc:Ignorable="w14 w15 w16se">
+<w:fonts xmlns:mc="http://schemas.openxmlformats.org/markup-compatibility/2006" xmlns:r="http://schemas.openxmlformats.org/officeDocument/2006/relationships" xmlns:w="http://schemas.openxmlformats.org/wordprocessingml/2006/main" xmlns:w14="http://schemas.microsoft.com/office/word/2010/wordml" xmlns:w15="http://schemas.microsoft.com/office/word/2012/wordml" xmlns:w16cex="http://schemas.microsoft.com/office/word/2018/wordml/cex" xmlns:w16cid="http://schemas.microsoft.com/office/word/2016/wordml/cid" xmlns:w16="http://schemas.microsoft.com/office/word/2018/wordml" xmlns:w16du="http://schemas.microsoft.com/office/word/2023/wordml/word16du" xmlns:w16sdtdh="http://schemas.microsoft.com/office/word/2020/wordml/sdtdatahash" xmlns:w16sdtfl="http://schemas.microsoft.com/office/word/2024/wordml/sdtformatlock" xmlns:w16se="http://schemas.microsoft.com/office/word/2015/wordml/symex" mc:Ignorable="w14 w15 w16se w16cid w16 w16cex w16sdtdh w16sdtfl w16du">
   <w:font w:name="Calibri">
     <w:panose1 w:val="020F0502020204030204"/>
     <w:charset w:val="00"/>
     <w:family w:val="swiss"/>
     <w:pitch w:val="variable"/>
-    <w:sig w:usb0="A00002EF" w:usb1="4000207B" w:usb2="00000000" w:usb3="00000000" w:csb0="0000009F" w:csb1="00000000"/>
+    <w:sig w:usb0="E4002EFF" w:usb1="C200247B" w:usb2="00000009" w:usb3="00000000" w:csb0="000001FF" w:csb1="00000000"/>
   </w:font>
   <w:font w:name="Courier New">
     <w:panose1 w:val="02070309020205020404"/>
@@ -3416,7 +3479,7 @@
     <w:charset w:val="00"/>
     <w:family w:val="roman"/>
     <w:pitch w:val="variable"/>
-    <w:sig w:usb0="E0002AFF" w:usb1="C0007843" w:usb2="00000009" w:usb3="00000000" w:csb0="000001FF" w:csb1="00000000"/>
+    <w:sig w:usb0="E0002EFF" w:usb1="C000785B" w:usb2="00000009" w:usb3="00000000" w:csb0="000001FF" w:csb1="00000000"/>
   </w:font>
   <w:font w:name="Wingdings">
     <w:panose1 w:val="05000000000000000000"/>
@@ -3437,20 +3500,32 @@
     <w:charset w:val="00"/>
     <w:family w:val="swiss"/>
     <w:pitch w:val="variable"/>
-    <w:sig w:usb0="E0002AFF" w:usb1="C0007843" w:usb2="00000009" w:usb3="00000000" w:csb0="000001FF" w:csb1="00000000"/>
+    <w:sig w:usb0="E0002EFF" w:usb1="C000785B" w:usb2="00000009" w:usb3="00000000" w:csb0="000001FF" w:csb1="00000000"/>
   </w:font>
   <w:font w:name="Calibri Light">
     <w:panose1 w:val="020F0302020204030204"/>
     <w:charset w:val="00"/>
     <w:family w:val="swiss"/>
     <w:pitch w:val="variable"/>
-    <w:sig w:usb0="A00002EF" w:usb1="4000207B" w:usb2="00000000" w:usb3="00000000" w:csb0="0000009F" w:csb1="00000000"/>
+    <w:sig w:usb0="E4002EFF" w:usb1="C200247B" w:usb2="00000009" w:usb3="00000000" w:csb0="000001FF" w:csb1="00000000"/>
+  </w:font>
+  <w:font w:name="Aptos">
+    <w:charset w:val="00"/>
+    <w:family w:val="swiss"/>
+    <w:pitch w:val="variable"/>
+    <w:sig w:usb0="20000287" w:usb1="00000003" w:usb2="00000000" w:usb3="00000000" w:csb0="0000019F" w:csb1="00000000"/>
+  </w:font>
+  <w:font w:name="Aptos Display">
+    <w:charset w:val="00"/>
+    <w:family w:val="swiss"/>
+    <w:pitch w:val="variable"/>
+    <w:sig w:usb0="20000287" w:usb1="00000003" w:usb2="00000000" w:usb3="00000000" w:csb0="0000019F" w:csb1="00000000"/>
   </w:font>
 </w:fonts>
 </file>
 
 <file path=word/glossary/settings.xml><?xml version="1.0" encoding="utf-8"?>
-<w:settings xmlns:mc="http://schemas.openxmlformats.org/markup-compatibility/2006" xmlns:o="urn:schemas-microsoft-com:office:office" xmlns:r="http://schemas.openxmlformats.org/officeDocument/2006/relationships" xmlns:m="http://schemas.openxmlformats.org/officeDocument/2006/math" xmlns:v="urn:schemas-microsoft-com:vml" xmlns:w10="urn:schemas-microsoft-com:office:word" xmlns:w="http://schemas.openxmlformats.org/wordprocessingml/2006/main" xmlns:w14="http://schemas.microsoft.com/office/word/2010/wordml" xmlns:w15="http://schemas.microsoft.com/office/word/2012/wordml" xmlns:w16se="http://schemas.microsoft.com/office/word/2015/wordml/symex" xmlns:sl="http://schemas.openxmlformats.org/schemaLibrary/2006/main" mc:Ignorable="w14 w15 w16se">
+<w:settings xmlns:mc="http://schemas.openxmlformats.org/markup-compatibility/2006" xmlns:o="urn:schemas-microsoft-com:office:office" xmlns:r="http://schemas.openxmlformats.org/officeDocument/2006/relationships" xmlns:m="http://schemas.openxmlformats.org/officeDocument/2006/math" xmlns:v="urn:schemas-microsoft-com:vml" xmlns:w10="urn:schemas-microsoft-com:office:word" xmlns:w="http://schemas.openxmlformats.org/wordprocessingml/2006/main" xmlns:w14="http://schemas.microsoft.com/office/word/2010/wordml" xmlns:w15="http://schemas.microsoft.com/office/word/2012/wordml" xmlns:w16cex="http://schemas.microsoft.com/office/word/2018/wordml/cex" xmlns:w16cid="http://schemas.microsoft.com/office/word/2016/wordml/cid" xmlns:w16="http://schemas.microsoft.com/office/word/2018/wordml" xmlns:w16du="http://schemas.microsoft.com/office/word/2023/wordml/word16du" xmlns:w16sdtdh="http://schemas.microsoft.com/office/word/2020/wordml/sdtdatahash" xmlns:w16sdtfl="http://schemas.microsoft.com/office/word/2024/wordml/sdtformatlock" xmlns:w16se="http://schemas.microsoft.com/office/word/2015/wordml/symex" xmlns:sl="http://schemas.openxmlformats.org/schemaLibrary/2006/main" mc:Ignorable="w14 w15 w16se w16cid w16 w16cex w16sdtdh w16sdtfl w16du">
   <w:view w:val="normal"/>
   <w:defaultTabStop w:val="708"/>
   <w:hyphenationZone w:val="425"/>
@@ -3462,6 +3537,7 @@
     <w:compatSetting w:name="enableOpenTypeFeatures" w:uri="http://schemas.microsoft.com/office/word" w:val="1"/>
     <w:compatSetting w:name="doNotFlipMirrorIndents" w:uri="http://schemas.microsoft.com/office/word" w:val="1"/>
     <w:compatSetting w:name="differentiateMultirowTableHeaders" w:uri="http://schemas.microsoft.com/office/word" w:val="1"/>
+    <w:compatSetting w:name="useWord2013TrackBottomHyphenation" w:uri="http://schemas.microsoft.com/office/word" w:val="1"/>
   </w:compat>
   <w:rsids>
     <w:rsidRoot w:val="00A6000A"/>
@@ -3469,7 +3545,9 @@
     <w:rsid w:val="008024E4"/>
     <w:rsid w:val="0086768F"/>
     <w:rsid w:val="00A6000A"/>
+    <w:rsid w:val="00BA37BE"/>
     <w:rsid w:val="00BC1523"/>
+    <w:rsid w:val="00F01ACE"/>
   </w:rsids>
   <m:mathPr>
     <m:mathFont m:val="Cambria Math"/>
@@ -3486,14 +3564,14 @@
   </m:mathPr>
   <w:themeFontLang w:val="es-ES"/>
   <w:clrSchemeMapping w:bg1="light1" w:t1="dark1" w:bg2="light2" w:t2="dark2" w:accent1="accent1" w:accent2="accent2" w:accent3="accent3" w:accent4="accent4" w:accent5="accent5" w:accent6="accent6" w:hyperlink="hyperlink" w:followedHyperlink="followedHyperlink"/>
-  <w:decimalSymbol w:val=","/>
-  <w:listSeparator w:val=";"/>
+  <w:decimalSymbol w:val="."/>
+  <w:listSeparator w:val=","/>
   <w15:chartTrackingRefBased/>
 </w:settings>
 </file>
 
 <file path=word/glossary/styles.xml><?xml version="1.0" encoding="utf-8"?>
-<w:styles xmlns:mc="http://schemas.openxmlformats.org/markup-compatibility/2006" xmlns:r="http://schemas.openxmlformats.org/officeDocument/2006/relationships" xmlns:w="http://schemas.openxmlformats.org/wordprocessingml/2006/main" xmlns:w14="http://schemas.microsoft.com/office/word/2010/wordml" xmlns:w15="http://schemas.microsoft.com/office/word/2012/wordml" xmlns:w16se="http://schemas.microsoft.com/office/word/2015/wordml/symex" mc:Ignorable="w14 w15 w16se">
+<w:styles xmlns:mc="http://schemas.openxmlformats.org/markup-compatibility/2006" xmlns:r="http://schemas.openxmlformats.org/officeDocument/2006/relationships" xmlns:w="http://schemas.openxmlformats.org/wordprocessingml/2006/main" xmlns:w14="http://schemas.microsoft.com/office/word/2010/wordml" xmlns:w15="http://schemas.microsoft.com/office/word/2012/wordml" xmlns:w16cex="http://schemas.microsoft.com/office/word/2018/wordml/cex" xmlns:w16cid="http://schemas.microsoft.com/office/word/2016/wordml/cid" xmlns:w16="http://schemas.microsoft.com/office/word/2018/wordml" xmlns:w16du="http://schemas.microsoft.com/office/word/2023/wordml/word16du" xmlns:w16sdtdh="http://schemas.microsoft.com/office/word/2020/wordml/sdtdatahash" xmlns:w16sdtfl="http://schemas.microsoft.com/office/word/2024/wordml/sdtformatlock" xmlns:w16se="http://schemas.microsoft.com/office/word/2015/wordml/symex" mc:Ignorable="w14 w15 w16se w16cid w16 w16cex w16sdtdh w16sdtfl w16du">
   <w:docDefaults>
     <w:rPrDefault>
       <w:rPr>
@@ -3509,7 +3587,7 @@
       </w:pPr>
     </w:pPrDefault>
   </w:docDefaults>
-  <w:latentStyles w:defLockedState="0" w:defUIPriority="99" w:defSemiHidden="0" w:defUnhideWhenUsed="0" w:defQFormat="0" w:count="371">
+  <w:latentStyles w:defLockedState="0" w:defUIPriority="99" w:defSemiHidden="0" w:defUnhideWhenUsed="0" w:defQFormat="0" w:count="376">
     <w:lsdException w:name="Normal" w:uiPriority="0" w:qFormat="1"/>
     <w:lsdException w:name="heading 1" w:uiPriority="9" w:qFormat="1"/>
     <w:lsdException w:name="heading 2" w:semiHidden="1" w:uiPriority="9" w:unhideWhenUsed="1" w:qFormat="1"/>
@@ -3881,18 +3959,23 @@
     <w:lsdException w:name="List Table 5 Dark Accent 6" w:uiPriority="50"/>
     <w:lsdException w:name="List Table 6 Colorful Accent 6" w:uiPriority="51"/>
     <w:lsdException w:name="List Table 7 Colorful Accent 6" w:uiPriority="52"/>
+    <w:lsdException w:name="Mention" w:semiHidden="1" w:unhideWhenUsed="1"/>
+    <w:lsdException w:name="Smart Hyperlink" w:semiHidden="1" w:unhideWhenUsed="1"/>
+    <w:lsdException w:name="Hashtag" w:semiHidden="1" w:unhideWhenUsed="1"/>
+    <w:lsdException w:name="Unresolved Mention" w:semiHidden="1" w:unhideWhenUsed="1"/>
+    <w:lsdException w:name="Smart Link" w:semiHidden="1" w:unhideWhenUsed="1"/>
   </w:latentStyles>
   <w:style w:type="paragraph" w:default="1" w:styleId="Normal">
     <w:name w:val="Normal"/>
     <w:qFormat/>
   </w:style>
-  <w:style w:type="character" w:default="1" w:styleId="Fuentedeprrafopredeter">
+  <w:style w:type="character" w:default="1" w:styleId="DefaultParagraphFont">
     <w:name w:val="Default Paragraph Font"/>
     <w:uiPriority w:val="1"/>
     <w:semiHidden/>
     <w:unhideWhenUsed/>
   </w:style>
-  <w:style w:type="table" w:default="1" w:styleId="Tablanormal">
+  <w:style w:type="table" w:default="1" w:styleId="TableNormal">
     <w:name w:val="Normal Table"/>
     <w:uiPriority w:val="99"/>
     <w:semiHidden/>
@@ -3907,7 +3990,7 @@
       </w:tblCellMar>
     </w:tblPr>
   </w:style>
-  <w:style w:type="numbering" w:default="1" w:styleId="Sinlista">
+  <w:style w:type="numbering" w:default="1" w:styleId="NoList">
     <w:name w:val="No List"/>
     <w:uiPriority w:val="99"/>
     <w:semiHidden/>
@@ -3921,9 +4004,9 @@
     <w:name w:val="D4D7EDDD4D94486C82551AE2417EC2EA"/>
     <w:rsid w:val="00A6000A"/>
   </w:style>
-  <w:style w:type="character" w:styleId="Textodelmarcadordeposicin">
+  <w:style w:type="character" w:styleId="PlaceholderText">
     <w:name w:val="Placeholder Text"/>
-    <w:basedOn w:val="Fuentedeprrafopredeter"/>
+    <w:basedOn w:val="DefaultParagraphFont"/>
     <w:uiPriority w:val="99"/>
     <w:semiHidden/>
     <w:rsid w:val="00A6000A"/>
@@ -3931,15 +4014,11 @@
       <w:color w:val="808080"/>
     </w:rPr>
   </w:style>
-  <w:style w:type="paragraph" w:customStyle="1" w:styleId="C36584FC01064947B213F10C91985141">
-    <w:name w:val="C36584FC01064947B213F10C91985141"/>
-    <w:rsid w:val="00A6000A"/>
-  </w:style>
 </w:styles>
 </file>
 
 <file path=word/glossary/webSettings.xml><?xml version="1.0" encoding="utf-8"?>
-<w:webSettings xmlns:mc="http://schemas.openxmlformats.org/markup-compatibility/2006" xmlns:r="http://schemas.openxmlformats.org/officeDocument/2006/relationships" xmlns:w="http://schemas.openxmlformats.org/wordprocessingml/2006/main" xmlns:w14="http://schemas.microsoft.com/office/word/2010/wordml" xmlns:w15="http://schemas.microsoft.com/office/word/2012/wordml" xmlns:w16se="http://schemas.microsoft.com/office/word/2015/wordml/symex" mc:Ignorable="w14 w15 w16se">
+<w:webSettings xmlns:mc="http://schemas.openxmlformats.org/markup-compatibility/2006" xmlns:r="http://schemas.openxmlformats.org/officeDocument/2006/relationships" xmlns:w="http://schemas.openxmlformats.org/wordprocessingml/2006/main" xmlns:w14="http://schemas.microsoft.com/office/word/2010/wordml" xmlns:w15="http://schemas.microsoft.com/office/word/2012/wordml" xmlns:w16cex="http://schemas.microsoft.com/office/word/2018/wordml/cex" xmlns:w16cid="http://schemas.microsoft.com/office/word/2016/wordml/cid" xmlns:w16="http://schemas.microsoft.com/office/word/2018/wordml" xmlns:w16du="http://schemas.microsoft.com/office/word/2023/wordml/word16du" xmlns:w16sdtdh="http://schemas.microsoft.com/office/word/2020/wordml/sdtdatahash" xmlns:w16sdtfl="http://schemas.microsoft.com/office/word/2024/wordml/sdtformatlock" xmlns:w16se="http://schemas.microsoft.com/office/word/2015/wordml/symex" mc:Ignorable="w14 w15 w16se w16cid w16 w16cex w16sdtdh w16sdtfl w16du">
   <w:optimizeForBrowser/>
   <w:allowPNG/>
 </w:webSettings>

</xml_diff>